<commit_message>
Update Kịch bản demo - bảo vệ DATN.docx
</commit_message>
<xml_diff>
--- a/src/main/resources/database/Kịch bản demo - bảo vệ DATN.docx
+++ b/src/main/resources/database/Kịch bản demo - bảo vệ DATN.docx
@@ -142,6 +142,38 @@
         </w:rPr>
         <w:t xml:space="preserve"> một khóa học (trạng thái mặc định là draft)</w:t>
       </w:r>
+      <w:r>
+        <w:rPr>
+          <w:rFonts w:asciiTheme="majorHAnsi" w:hAnsiTheme="majorHAnsi" w:cstheme="majorHAnsi"/>
+          <w:sz w:val="28"/>
+          <w:szCs w:val="28"/>
+        </w:rPr>
+        <w:br/>
+      </w:r>
+      <w:r>
+        <w:rPr>
+          <w:rFonts w:asciiTheme="majorHAnsi" w:hAnsiTheme="majorHAnsi" w:cstheme="majorHAnsi"/>
+          <w:sz w:val="28"/>
+          <w:szCs w:val="28"/>
+        </w:rPr>
+        <w:t xml:space="preserve">(Admin và Instructor có thể preview </w:t>
+      </w:r>
+      <w:r>
+        <w:rPr>
+          <w:rFonts w:asciiTheme="majorHAnsi" w:hAnsiTheme="majorHAnsi" w:cstheme="majorHAnsi"/>
+          <w:sz w:val="28"/>
+          <w:szCs w:val="28"/>
+        </w:rPr>
+        <w:t>khóa học</w:t>
+      </w:r>
+      <w:r>
+        <w:rPr>
+          <w:rFonts w:asciiTheme="majorHAnsi" w:hAnsiTheme="majorHAnsi" w:cstheme="majorHAnsi"/>
+          <w:sz w:val="28"/>
+          <w:szCs w:val="28"/>
+        </w:rPr>
+        <w:t>)</w:t>
+      </w:r>
     </w:p>
     <w:p>
       <w:pPr>
@@ -208,6 +240,15 @@
         </w:rPr>
         <w:t>Xem chi tiết các khóa học đang yêu cầu phê duyệt</w:t>
       </w:r>
+      <w:r>
+        <w:rPr>
+          <w:rFonts w:asciiTheme="majorHAnsi" w:hAnsiTheme="majorHAnsi" w:cstheme="majorHAnsi"/>
+          <w:sz w:val="28"/>
+          <w:szCs w:val="28"/>
+        </w:rPr>
+        <w:br/>
+        <w:t>(Admin và Instructor có thể preview khóa học)</w:t>
+      </w:r>
     </w:p>
     <w:p>
       <w:pPr>
@@ -390,7 +431,24 @@
           <w:sz w:val="28"/>
           <w:szCs w:val="28"/>
         </w:rPr>
-        <w:t>Làm quiz và nhận ngay kết quả</w:t>
+        <w:t>Làm quiz</w:t>
+      </w:r>
+      <w:r>
+        <w:rPr>
+          <w:rFonts w:asciiTheme="majorHAnsi" w:hAnsiTheme="majorHAnsi" w:cstheme="majorHAnsi"/>
+          <w:sz w:val="28"/>
+          <w:szCs w:val="28"/>
+          <w:lang w:val="en-US"/>
+        </w:rPr>
+        <w:t xml:space="preserve"> (Chỉ</w:t>
+      </w:r>
+      <w:r>
+        <w:rPr>
+          <w:rFonts w:asciiTheme="majorHAnsi" w:hAnsiTheme="majorHAnsi" w:cstheme="majorHAnsi"/>
+          <w:sz w:val="28"/>
+          <w:szCs w:val="28"/>
+        </w:rPr>
+        <w:t xml:space="preserve"> student mới có thể submit quiz)</w:t>
       </w:r>
     </w:p>
     <w:p>
@@ -434,7 +492,31 @@
           <w:sz w:val="28"/>
           <w:szCs w:val="28"/>
         </w:rPr>
-        <w:t>Vào bảng điều khiển -&gt; tiến độ</w:t>
+        <w:t xml:space="preserve">Xem </w:t>
+      </w:r>
+      <w:r>
+        <w:rPr>
+          <w:rFonts w:asciiTheme="majorHAnsi" w:hAnsiTheme="majorHAnsi" w:cstheme="majorHAnsi"/>
+          <w:sz w:val="28"/>
+          <w:szCs w:val="28"/>
+        </w:rPr>
+        <w:t xml:space="preserve">danh sách </w:t>
+      </w:r>
+      <w:r>
+        <w:rPr>
+          <w:rFonts w:asciiTheme="majorHAnsi" w:hAnsiTheme="majorHAnsi" w:cstheme="majorHAnsi"/>
+          <w:sz w:val="28"/>
+          <w:szCs w:val="28"/>
+        </w:rPr>
+        <w:t>tiến độ làm quiz</w:t>
+      </w:r>
+      <w:r>
+        <w:rPr>
+          <w:rFonts w:asciiTheme="majorHAnsi" w:hAnsiTheme="majorHAnsi" w:cstheme="majorHAnsi"/>
+          <w:sz w:val="28"/>
+          <w:szCs w:val="28"/>
+        </w:rPr>
+        <w:t xml:space="preserve"> cá nhân các khóa học</w:t>
       </w:r>
     </w:p>
     <w:p>
@@ -456,7 +538,7 @@
           <w:sz w:val="28"/>
           <w:szCs w:val="28"/>
         </w:rPr>
-        <w:t>Xem tiến độ làm quiz cá nhân theo khóa học</w:t>
+        <w:t>Lọc theo danh sách theo khóa học</w:t>
       </w:r>
     </w:p>
     <w:p>
@@ -500,7 +582,7 @@
           <w:sz w:val="28"/>
           <w:szCs w:val="28"/>
         </w:rPr>
-        <w:t>Vào bảng điều khiển -&gt; thống kê Quizz</w:t>
+        <w:t>Xem danh sách học viên và tiến độ của từng người theo khóa học</w:t>
       </w:r>
     </w:p>
     <w:p>
@@ -522,7 +604,7 @@
           <w:sz w:val="28"/>
           <w:szCs w:val="28"/>
         </w:rPr>
-        <w:t>Xem danh sách học viên và tiến độ của từng người theo khóa học</w:t>
+        <w:t>Lọc danh sách theo khóa học</w:t>
       </w:r>
     </w:p>
     <w:sectPr>

</xml_diff>

<commit_message>
thêm preview khóa học trong trang phê duyệt khóa học
</commit_message>
<xml_diff>
--- a/src/main/resources/database/Kịch bản demo - bảo vệ DATN.docx
+++ b/src/main/resources/database/Kịch bản demo - bảo vệ DATN.docx
@@ -33,13 +33,17 @@
         </w:numPr>
         <w:rPr>
           <w:rFonts w:asciiTheme="majorHAnsi" w:hAnsiTheme="majorHAnsi" w:cstheme="majorHAnsi"/>
-          <w:sz w:val="28"/>
-          <w:szCs w:val="28"/>
-        </w:rPr>
-      </w:pPr>
-      <w:r>
-        <w:rPr>
-          <w:rFonts w:asciiTheme="majorHAnsi" w:hAnsiTheme="majorHAnsi" w:cstheme="majorHAnsi"/>
+          <w:b/>
+          <w:bCs/>
+          <w:sz w:val="28"/>
+          <w:szCs w:val="28"/>
+        </w:rPr>
+      </w:pPr>
+      <w:r>
+        <w:rPr>
+          <w:rFonts w:asciiTheme="majorHAnsi" w:hAnsiTheme="majorHAnsi" w:cstheme="majorHAnsi"/>
+          <w:b/>
+          <w:bCs/>
           <w:sz w:val="28"/>
           <w:szCs w:val="28"/>
         </w:rPr>
@@ -65,7 +69,35 @@
           <w:sz w:val="28"/>
           <w:szCs w:val="28"/>
         </w:rPr>
-        <w:t>Đăng nhập tài khoản Admin và truy cập trang admin</w:t>
+        <w:t xml:space="preserve">Bước 1: Truy cập trang admin ( </w:t>
+      </w:r>
+      <w:hyperlink r:id="rId5" w:history="1">
+        <w:r>
+          <w:rPr>
+            <w:rStyle w:val="Hyperlink"/>
+            <w:rFonts w:asciiTheme="majorHAnsi" w:hAnsiTheme="majorHAnsi" w:cstheme="majorHAnsi"/>
+            <w:sz w:val="28"/>
+            <w:szCs w:val="28"/>
+          </w:rPr>
+          <w:t>http://localhost:8080/</w:t>
+        </w:r>
+        <w:r>
+          <w:rPr>
+            <w:rStyle w:val="Hyperlink"/>
+            <w:rFonts w:asciiTheme="majorHAnsi" w:hAnsiTheme="majorHAnsi" w:cstheme="majorHAnsi"/>
+            <w:sz w:val="28"/>
+            <w:szCs w:val="28"/>
+          </w:rPr>
+          <w:t>admin</w:t>
+        </w:r>
+      </w:hyperlink>
+      <w:r>
+        <w:rPr>
+          <w:rFonts w:asciiTheme="majorHAnsi" w:hAnsiTheme="majorHAnsi" w:cstheme="majorHAnsi"/>
+          <w:sz w:val="28"/>
+          <w:szCs w:val="28"/>
+        </w:rPr>
+        <w:t xml:space="preserve"> )</w:t>
       </w:r>
     </w:p>
     <w:p>
@@ -87,7 +119,40 @@
           <w:sz w:val="28"/>
           <w:szCs w:val="28"/>
         </w:rPr>
-        <w:t>Tạo 1 tài khoản thủ công có cấp quyền Instructor</w:t>
+        <w:t xml:space="preserve">Bước 2: </w:t>
+      </w:r>
+      <w:r>
+        <w:rPr>
+          <w:rFonts w:asciiTheme="majorHAnsi" w:hAnsiTheme="majorHAnsi" w:cstheme="majorHAnsi"/>
+          <w:sz w:val="28"/>
+          <w:szCs w:val="28"/>
+        </w:rPr>
+        <w:t>Đăng nhập tài khoản Admin</w:t>
+      </w:r>
+      <w:r>
+        <w:rPr>
+          <w:rFonts w:asciiTheme="majorHAnsi" w:hAnsiTheme="majorHAnsi" w:cstheme="majorHAnsi"/>
+          <w:sz w:val="28"/>
+          <w:szCs w:val="28"/>
+        </w:rPr>
+        <w:br/>
+        <w:t>(</w:t>
+      </w:r>
+      <w:r>
+        <w:rPr>
+          <w:rFonts w:asciiTheme="majorHAnsi" w:hAnsiTheme="majorHAnsi" w:cstheme="majorHAnsi"/>
+          <w:sz w:val="28"/>
+          <w:szCs w:val="28"/>
+        </w:rPr>
+        <w:t>admin@viettutor.com</w:t>
+      </w:r>
+      <w:r>
+        <w:rPr>
+          <w:rFonts w:asciiTheme="majorHAnsi" w:hAnsiTheme="majorHAnsi" w:cstheme="majorHAnsi"/>
+          <w:sz w:val="28"/>
+          <w:szCs w:val="28"/>
+        </w:rPr>
+        <w:t xml:space="preserve"> | 123456)</w:t>
       </w:r>
     </w:p>
     <w:p>
@@ -109,7 +174,179 @@
           <w:sz w:val="28"/>
           <w:szCs w:val="28"/>
         </w:rPr>
-        <w:t>Tạo hàng loạt tài khoản Student theo file danh sách có sẵn</w:t>
+        <w:t>Bước 3:</w:t>
+      </w:r>
+      <w:r>
+        <w:rPr>
+          <w:rFonts w:asciiTheme="majorHAnsi" w:hAnsiTheme="majorHAnsi" w:cstheme="majorHAnsi"/>
+          <w:sz w:val="28"/>
+          <w:szCs w:val="28"/>
+        </w:rPr>
+        <w:t xml:space="preserve"> </w:t>
+      </w:r>
+      <w:r>
+        <w:rPr>
+          <w:rFonts w:asciiTheme="majorHAnsi" w:hAnsiTheme="majorHAnsi" w:cstheme="majorHAnsi"/>
+          <w:sz w:val="28"/>
+          <w:szCs w:val="28"/>
+        </w:rPr>
+        <w:t xml:space="preserve">Chọn Tài khoản </w:t>
+      </w:r>
+      <w:r>
+        <w:rPr>
+          <w:rFonts w:asciiTheme="majorHAnsi" w:hAnsiTheme="majorHAnsi" w:cstheme="majorHAnsi"/>
+          <w:sz w:val="28"/>
+          <w:szCs w:val="28"/>
+        </w:rPr>
+        <w:t>→</w:t>
+      </w:r>
+      <w:r>
+        <w:rPr>
+          <w:rFonts w:cs="Segoe UI Emoji"/>
+          <w:sz w:val="28"/>
+          <w:szCs w:val="28"/>
+        </w:rPr>
+        <w:t xml:space="preserve"> </w:t>
+      </w:r>
+      <w:r>
+        <w:rPr>
+          <w:rFonts w:asciiTheme="majorHAnsi" w:hAnsiTheme="majorHAnsi" w:cstheme="majorHAnsi"/>
+          <w:sz w:val="28"/>
+          <w:szCs w:val="28"/>
+        </w:rPr>
+        <w:t>Giảng viên, học viên</w:t>
+      </w:r>
+    </w:p>
+    <w:p>
+      <w:pPr>
+        <w:pStyle w:val="ListParagraph"/>
+        <w:numPr>
+          <w:ilvl w:val="1"/>
+          <w:numId w:val="2"/>
+        </w:numPr>
+        <w:rPr>
+          <w:rFonts w:asciiTheme="majorHAnsi" w:hAnsiTheme="majorHAnsi" w:cstheme="majorHAnsi"/>
+          <w:sz w:val="28"/>
+          <w:szCs w:val="28"/>
+        </w:rPr>
+      </w:pPr>
+      <w:r>
+        <w:rPr>
+          <w:rFonts w:asciiTheme="majorHAnsi" w:hAnsiTheme="majorHAnsi" w:cstheme="majorHAnsi"/>
+          <w:sz w:val="28"/>
+          <w:szCs w:val="28"/>
+        </w:rPr>
+        <w:t xml:space="preserve">Bước 4: Chọn nhập excel </w:t>
+      </w:r>
+      <w:r>
+        <w:rPr>
+          <w:rFonts w:asciiTheme="majorHAnsi" w:hAnsiTheme="majorHAnsi" w:cstheme="majorHAnsi"/>
+          <w:sz w:val="28"/>
+          <w:szCs w:val="28"/>
+        </w:rPr>
+        <w:t>→</w:t>
+      </w:r>
+      <w:r>
+        <w:rPr>
+          <w:rFonts w:cs="Segoe UI Emoji"/>
+          <w:sz w:val="28"/>
+          <w:szCs w:val="28"/>
+        </w:rPr>
+        <w:t xml:space="preserve"> </w:t>
+      </w:r>
+      <w:r>
+        <w:rPr>
+          <w:rFonts w:asciiTheme="majorHAnsi" w:hAnsiTheme="majorHAnsi" w:cstheme="majorHAnsi"/>
+          <w:sz w:val="28"/>
+          <w:szCs w:val="28"/>
+        </w:rPr>
+        <w:t>tải file danh sách excel lên</w:t>
+      </w:r>
+      <w:r>
+        <w:rPr>
+          <w:rFonts w:asciiTheme="majorHAnsi" w:hAnsiTheme="majorHAnsi" w:cstheme="majorHAnsi"/>
+          <w:sz w:val="28"/>
+          <w:szCs w:val="28"/>
+        </w:rPr>
+        <w:br/>
+        <w:t>(File danh sách sinh viên mẫu có trong thư mục resources/database/ của dự án)</w:t>
+      </w:r>
+    </w:p>
+    <w:p>
+      <w:pPr>
+        <w:pStyle w:val="ListParagraph"/>
+        <w:numPr>
+          <w:ilvl w:val="1"/>
+          <w:numId w:val="2"/>
+        </w:numPr>
+        <w:rPr>
+          <w:rFonts w:asciiTheme="majorHAnsi" w:hAnsiTheme="majorHAnsi" w:cstheme="majorHAnsi"/>
+          <w:sz w:val="28"/>
+          <w:szCs w:val="28"/>
+        </w:rPr>
+      </w:pPr>
+      <w:r>
+        <w:rPr>
+          <w:rFonts w:asciiTheme="majorHAnsi" w:hAnsiTheme="majorHAnsi" w:cstheme="majorHAnsi"/>
+          <w:sz w:val="28"/>
+          <w:szCs w:val="28"/>
+        </w:rPr>
+        <w:t xml:space="preserve">Bước 5: </w:t>
+      </w:r>
+      <w:r>
+        <w:rPr>
+          <w:rFonts w:asciiTheme="majorHAnsi" w:hAnsiTheme="majorHAnsi" w:cstheme="majorHAnsi"/>
+          <w:sz w:val="28"/>
+          <w:szCs w:val="28"/>
+        </w:rPr>
+        <w:t>N</w:t>
+      </w:r>
+      <w:r>
+        <w:rPr>
+          <w:rFonts w:asciiTheme="majorHAnsi" w:hAnsiTheme="majorHAnsi" w:cstheme="majorHAnsi"/>
+          <w:sz w:val="28"/>
+          <w:szCs w:val="28"/>
+        </w:rPr>
+        <w:t xml:space="preserve">hấn xác nhận và nhập dữ </w:t>
+      </w:r>
+      <w:r>
+        <w:rPr>
+          <w:rFonts w:asciiTheme="majorHAnsi" w:hAnsiTheme="majorHAnsi" w:cstheme="majorHAnsi"/>
+          <w:sz w:val="28"/>
+          <w:szCs w:val="28"/>
+        </w:rPr>
+        <w:t>liệu</w:t>
+      </w:r>
+    </w:p>
+    <w:p>
+      <w:pPr>
+        <w:pStyle w:val="ListParagraph"/>
+        <w:numPr>
+          <w:ilvl w:val="1"/>
+          <w:numId w:val="2"/>
+        </w:numPr>
+        <w:rPr>
+          <w:rFonts w:asciiTheme="majorHAnsi" w:hAnsiTheme="majorHAnsi" w:cstheme="majorHAnsi"/>
+          <w:sz w:val="28"/>
+          <w:szCs w:val="28"/>
+        </w:rPr>
+      </w:pPr>
+      <w:r>
+        <w:rPr>
+          <w:rFonts w:asciiTheme="majorHAnsi" w:hAnsiTheme="majorHAnsi" w:cstheme="majorHAnsi"/>
+          <w:sz w:val="28"/>
+          <w:szCs w:val="28"/>
+        </w:rPr>
+        <w:t>Bước 6: Chờ 1 lúc để hệ thống tạo dần các tài khoản</w:t>
+      </w:r>
+      <w:r>
+        <w:rPr>
+          <w:rFonts w:asciiTheme="majorHAnsi" w:hAnsiTheme="majorHAnsi" w:cstheme="majorHAnsi"/>
+          <w:sz w:val="28"/>
+          <w:szCs w:val="28"/>
+        </w:rPr>
+        <w:br/>
+        <w:t>(Do phải mã hóa mật khẩu nên không thể tạo hết các tài khoản ngay được, nhấn F5 để tải trang và làm mới dữ liệu)</w:t>
       </w:r>
     </w:p>
     <w:p>
@@ -121,13 +358,17 @@
         </w:numPr>
         <w:rPr>
           <w:rFonts w:asciiTheme="majorHAnsi" w:hAnsiTheme="majorHAnsi" w:cstheme="majorHAnsi"/>
-          <w:sz w:val="28"/>
-          <w:szCs w:val="28"/>
-        </w:rPr>
-      </w:pPr>
-      <w:r>
-        <w:rPr>
-          <w:rFonts w:asciiTheme="majorHAnsi" w:hAnsiTheme="majorHAnsi" w:cstheme="majorHAnsi"/>
+          <w:b/>
+          <w:bCs/>
+          <w:sz w:val="28"/>
+          <w:szCs w:val="28"/>
+        </w:rPr>
+      </w:pPr>
+      <w:r>
+        <w:rPr>
+          <w:rFonts w:asciiTheme="majorHAnsi" w:hAnsiTheme="majorHAnsi" w:cstheme="majorHAnsi"/>
+          <w:b/>
+          <w:bCs/>
           <w:sz w:val="28"/>
           <w:szCs w:val="28"/>
         </w:rPr>
@@ -153,7 +394,58 @@
           <w:sz w:val="28"/>
           <w:szCs w:val="28"/>
         </w:rPr>
-        <w:t>Đăng nhập tài khoản Instructor</w:t>
+        <w:t xml:space="preserve">Bước 1: Truy cập </w:t>
+      </w:r>
+      <w:r>
+        <w:rPr>
+          <w:rFonts w:asciiTheme="majorHAnsi" w:hAnsiTheme="majorHAnsi" w:cstheme="majorHAnsi"/>
+          <w:sz w:val="28"/>
+          <w:szCs w:val="28"/>
+        </w:rPr>
+        <w:t>trang client</w:t>
+      </w:r>
+      <w:r>
+        <w:rPr>
+          <w:rFonts w:asciiTheme="majorHAnsi" w:hAnsiTheme="majorHAnsi" w:cstheme="majorHAnsi"/>
+          <w:sz w:val="28"/>
+          <w:szCs w:val="28"/>
+        </w:rPr>
+        <w:t xml:space="preserve"> (</w:t>
+      </w:r>
+      <w:r>
+        <w:rPr>
+          <w:rFonts w:asciiTheme="majorHAnsi" w:hAnsiTheme="majorHAnsi" w:cstheme="majorHAnsi"/>
+          <w:sz w:val="28"/>
+          <w:szCs w:val="28"/>
+        </w:rPr>
+        <w:t xml:space="preserve"> </w:t>
+      </w:r>
+      <w:hyperlink r:id="rId6" w:history="1">
+        <w:r>
+          <w:rPr>
+            <w:rStyle w:val="Hyperlink"/>
+            <w:rFonts w:asciiTheme="majorHAnsi" w:hAnsiTheme="majorHAnsi" w:cstheme="majorHAnsi"/>
+            <w:sz w:val="28"/>
+            <w:szCs w:val="28"/>
+          </w:rPr>
+          <w:t>http://localhost:8080</w:t>
+        </w:r>
+      </w:hyperlink>
+      <w:r>
+        <w:rPr>
+          <w:rFonts w:asciiTheme="majorHAnsi" w:hAnsiTheme="majorHAnsi" w:cstheme="majorHAnsi"/>
+          <w:sz w:val="28"/>
+          <w:szCs w:val="28"/>
+        </w:rPr>
+        <w:t xml:space="preserve"> </w:t>
+      </w:r>
+      <w:r>
+        <w:rPr>
+          <w:rFonts w:asciiTheme="majorHAnsi" w:hAnsiTheme="majorHAnsi" w:cstheme="majorHAnsi"/>
+          <w:sz w:val="28"/>
+          <w:szCs w:val="28"/>
+        </w:rPr>
+        <w:t>)</w:t>
       </w:r>
     </w:p>
     <w:p>
@@ -174,17 +466,16 @@
           <w:rFonts w:asciiTheme="majorHAnsi" w:hAnsiTheme="majorHAnsi" w:cstheme="majorHAnsi"/>
           <w:sz w:val="28"/>
           <w:szCs w:val="28"/>
-          <w:lang w:val="en-US"/>
-        </w:rPr>
-        <w:t>Tạo</w:t>
-      </w:r>
-      <w:r>
-        <w:rPr>
-          <w:rFonts w:asciiTheme="majorHAnsi" w:hAnsiTheme="majorHAnsi" w:cstheme="majorHAnsi"/>
-          <w:sz w:val="28"/>
-          <w:szCs w:val="28"/>
-        </w:rPr>
-        <w:t xml:space="preserve"> một khóa học (trạng thái mặc định là draft)</w:t>
+        </w:rPr>
+        <w:t xml:space="preserve">Bước 2: </w:t>
+      </w:r>
+      <w:r>
+        <w:rPr>
+          <w:rFonts w:asciiTheme="majorHAnsi" w:hAnsiTheme="majorHAnsi" w:cstheme="majorHAnsi"/>
+          <w:sz w:val="28"/>
+          <w:szCs w:val="28"/>
+        </w:rPr>
+        <w:t>Đăng nhập tài khoản Instructor</w:t>
       </w:r>
       <w:r>
         <w:rPr>
@@ -193,7 +484,30 @@
           <w:szCs w:val="28"/>
         </w:rPr>
         <w:br/>
-        <w:t>(Admin và Instructor có thể preview khóa học)</w:t>
+      </w:r>
+      <w:r>
+        <w:rPr>
+          <w:rFonts w:asciiTheme="majorHAnsi" w:hAnsiTheme="majorHAnsi" w:cstheme="majorHAnsi"/>
+          <w:sz w:val="28"/>
+          <w:szCs w:val="28"/>
+        </w:rPr>
+        <w:t>(</w:t>
+      </w:r>
+      <w:r>
+        <w:rPr>
+          <w:rFonts w:asciiTheme="majorHAnsi" w:hAnsiTheme="majorHAnsi" w:cstheme="majorHAnsi"/>
+          <w:sz w:val="28"/>
+          <w:szCs w:val="28"/>
+        </w:rPr>
+        <w:t>john@viettutor.com</w:t>
+      </w:r>
+      <w:r>
+        <w:rPr>
+          <w:rFonts w:asciiTheme="majorHAnsi" w:hAnsiTheme="majorHAnsi" w:cstheme="majorHAnsi"/>
+          <w:sz w:val="28"/>
+          <w:szCs w:val="28"/>
+        </w:rPr>
+        <w:t xml:space="preserve"> | 123456)</w:t>
       </w:r>
     </w:p>
     <w:p>
@@ -215,7 +529,2123 @@
           <w:sz w:val="28"/>
           <w:szCs w:val="28"/>
         </w:rPr>
-        <w:t>Gửi yêu cầu phê duyệt khóa học đến Admin</w:t>
+        <w:t>Bước 3: Di chuột đến email trên header để mở hộp thoại dropdown</w:t>
+      </w:r>
+    </w:p>
+    <w:p>
+      <w:pPr>
+        <w:pStyle w:val="ListParagraph"/>
+        <w:numPr>
+          <w:ilvl w:val="1"/>
+          <w:numId w:val="2"/>
+        </w:numPr>
+        <w:rPr>
+          <w:rFonts w:asciiTheme="majorHAnsi" w:hAnsiTheme="majorHAnsi" w:cstheme="majorHAnsi"/>
+          <w:sz w:val="28"/>
+          <w:szCs w:val="28"/>
+        </w:rPr>
+      </w:pPr>
+      <w:r>
+        <w:rPr>
+          <w:rFonts w:asciiTheme="majorHAnsi" w:hAnsiTheme="majorHAnsi" w:cstheme="majorHAnsi"/>
+          <w:sz w:val="28"/>
+          <w:szCs w:val="28"/>
+        </w:rPr>
+        <w:t xml:space="preserve">Bước 4: Chọn Bảng điều khiển </w:t>
+      </w:r>
+      <w:r>
+        <w:rPr>
+          <w:rFonts w:asciiTheme="majorHAnsi" w:hAnsiTheme="majorHAnsi" w:cstheme="majorHAnsi"/>
+          <w:sz w:val="28"/>
+          <w:szCs w:val="28"/>
+        </w:rPr>
+        <w:t>→</w:t>
+      </w:r>
+      <w:r>
+        <w:rPr>
+          <w:rFonts w:asciiTheme="majorHAnsi" w:hAnsiTheme="majorHAnsi" w:cstheme="majorHAnsi"/>
+          <w:sz w:val="28"/>
+          <w:szCs w:val="28"/>
+        </w:rPr>
+        <w:t xml:space="preserve"> Tạo khóa học mới</w:t>
+      </w:r>
+    </w:p>
+    <w:p>
+      <w:pPr>
+        <w:pStyle w:val="ListParagraph"/>
+        <w:numPr>
+          <w:ilvl w:val="1"/>
+          <w:numId w:val="2"/>
+        </w:numPr>
+        <w:rPr>
+          <w:rFonts w:asciiTheme="majorHAnsi" w:hAnsiTheme="majorHAnsi" w:cstheme="majorHAnsi"/>
+          <w:sz w:val="28"/>
+          <w:szCs w:val="28"/>
+        </w:rPr>
+      </w:pPr>
+      <w:r>
+        <w:rPr>
+          <w:rFonts w:asciiTheme="majorHAnsi" w:hAnsiTheme="majorHAnsi" w:cstheme="majorHAnsi"/>
+          <w:sz w:val="28"/>
+          <w:szCs w:val="28"/>
+        </w:rPr>
+        <w:t>Bước 5: Nhập đầy đủ phần thông tin khóa học (bắt buộc)</w:t>
+      </w:r>
+    </w:p>
+    <w:p>
+      <w:pPr>
+        <w:pStyle w:val="ListParagraph"/>
+        <w:numPr>
+          <w:ilvl w:val="1"/>
+          <w:numId w:val="2"/>
+        </w:numPr>
+        <w:rPr>
+          <w:rFonts w:asciiTheme="majorHAnsi" w:hAnsiTheme="majorHAnsi" w:cstheme="majorHAnsi"/>
+          <w:sz w:val="28"/>
+          <w:szCs w:val="28"/>
+        </w:rPr>
+      </w:pPr>
+      <w:r>
+        <w:rPr>
+          <w:rFonts w:asciiTheme="majorHAnsi" w:hAnsiTheme="majorHAnsi" w:cstheme="majorHAnsi"/>
+          <w:sz w:val="28"/>
+          <w:szCs w:val="28"/>
+        </w:rPr>
+        <w:t xml:space="preserve">Bước 6: Vào phần xây dựng khóa học để bắt đầu thiết kế nội dung khóa </w:t>
+      </w:r>
+      <w:r>
+        <w:rPr>
+          <w:rFonts w:asciiTheme="majorHAnsi" w:hAnsiTheme="majorHAnsi" w:cstheme="majorHAnsi"/>
+          <w:sz w:val="28"/>
+          <w:szCs w:val="28"/>
+        </w:rPr>
+        <w:t>học:</w:t>
+      </w:r>
+    </w:p>
+    <w:p>
+      <w:pPr>
+        <w:pStyle w:val="ListParagraph"/>
+        <w:numPr>
+          <w:ilvl w:val="2"/>
+          <w:numId w:val="2"/>
+        </w:numPr>
+        <w:rPr>
+          <w:rFonts w:asciiTheme="majorHAnsi" w:hAnsiTheme="majorHAnsi" w:cstheme="majorHAnsi"/>
+          <w:sz w:val="28"/>
+          <w:szCs w:val="28"/>
+        </w:rPr>
+      </w:pPr>
+      <w:r>
+        <w:rPr>
+          <w:rFonts w:asciiTheme="majorHAnsi" w:hAnsiTheme="majorHAnsi" w:cstheme="majorHAnsi"/>
+          <w:sz w:val="28"/>
+          <w:szCs w:val="28"/>
+        </w:rPr>
+        <w:t>Nhấn thêm chủ đề mới để tạo chương mới</w:t>
+      </w:r>
+    </w:p>
+    <w:p>
+      <w:pPr>
+        <w:pStyle w:val="ListParagraph"/>
+        <w:numPr>
+          <w:ilvl w:val="2"/>
+          <w:numId w:val="2"/>
+        </w:numPr>
+        <w:rPr>
+          <w:rFonts w:asciiTheme="majorHAnsi" w:hAnsiTheme="majorHAnsi" w:cstheme="majorHAnsi"/>
+          <w:sz w:val="28"/>
+          <w:szCs w:val="28"/>
+        </w:rPr>
+      </w:pPr>
+      <w:r>
+        <w:rPr>
+          <w:rFonts w:asciiTheme="majorHAnsi" w:hAnsiTheme="majorHAnsi" w:cstheme="majorHAnsi"/>
+          <w:sz w:val="28"/>
+          <w:szCs w:val="28"/>
+        </w:rPr>
+        <w:t>Nhấn tải tệp đính kèm để đính kèm các tệp học liệu</w:t>
+      </w:r>
+    </w:p>
+    <w:p>
+      <w:pPr>
+        <w:pStyle w:val="ListParagraph"/>
+        <w:numPr>
+          <w:ilvl w:val="2"/>
+          <w:numId w:val="2"/>
+        </w:numPr>
+        <w:rPr>
+          <w:rFonts w:asciiTheme="majorHAnsi" w:hAnsiTheme="majorHAnsi" w:cstheme="majorHAnsi"/>
+          <w:sz w:val="28"/>
+          <w:szCs w:val="28"/>
+        </w:rPr>
+      </w:pPr>
+      <w:r>
+        <w:rPr>
+          <w:rFonts w:asciiTheme="majorHAnsi" w:hAnsiTheme="majorHAnsi" w:cstheme="majorHAnsi"/>
+          <w:sz w:val="28"/>
+          <w:szCs w:val="28"/>
+        </w:rPr>
+        <w:t>Mở rộng các chương và chọn lần lượt lượt bài học, quiz, assignment để thêm video bài giảng, quiz và assignment</w:t>
+      </w:r>
+    </w:p>
+    <w:p>
+      <w:pPr>
+        <w:pStyle w:val="ListParagraph"/>
+        <w:numPr>
+          <w:ilvl w:val="2"/>
+          <w:numId w:val="2"/>
+        </w:numPr>
+        <w:rPr>
+          <w:rFonts w:asciiTheme="majorHAnsi" w:hAnsiTheme="majorHAnsi" w:cstheme="majorHAnsi"/>
+          <w:sz w:val="28"/>
+          <w:szCs w:val="28"/>
+        </w:rPr>
+      </w:pPr>
+      <w:r>
+        <w:rPr>
+          <w:rFonts w:asciiTheme="majorHAnsi" w:hAnsiTheme="majorHAnsi" w:cstheme="majorHAnsi"/>
+          <w:sz w:val="28"/>
+          <w:szCs w:val="28"/>
+        </w:rPr>
+        <w:t>Dữ liệu mẫu:</w:t>
+      </w:r>
+    </w:p>
+    <w:tbl>
+      <w:tblPr>
+        <w:tblStyle w:val="TableGrid"/>
+        <w:tblW w:w="0" w:type="auto"/>
+        <w:tblLook w:val="04A0" w:firstRow="1" w:lastRow="0" w:firstColumn="1" w:lastColumn="0" w:noHBand="0" w:noVBand="1"/>
+      </w:tblPr>
+      <w:tblGrid>
+        <w:gridCol w:w="1413"/>
+        <w:gridCol w:w="2410"/>
+        <w:gridCol w:w="5193"/>
+      </w:tblGrid>
+      <w:tr>
+        <w:trPr>
+          <w:trHeight w:val="567"/>
+        </w:trPr>
+        <w:tc>
+          <w:tcPr>
+            <w:tcW w:w="1413" w:type="dxa"/>
+            <w:vAlign w:val="center"/>
+          </w:tcPr>
+          <w:p>
+            <w:pPr>
+              <w:jc w:val="center"/>
+              <w:rPr>
+                <w:rFonts w:asciiTheme="majorHAnsi" w:hAnsiTheme="majorHAnsi" w:cstheme="majorHAnsi"/>
+                <w:b/>
+                <w:bCs/>
+                <w:sz w:val="28"/>
+                <w:szCs w:val="28"/>
+              </w:rPr>
+            </w:pPr>
+          </w:p>
+        </w:tc>
+        <w:tc>
+          <w:tcPr>
+            <w:tcW w:w="2410" w:type="dxa"/>
+            <w:vAlign w:val="center"/>
+          </w:tcPr>
+          <w:p>
+            <w:pPr>
+              <w:jc w:val="center"/>
+              <w:rPr>
+                <w:rFonts w:asciiTheme="majorHAnsi" w:hAnsiTheme="majorHAnsi" w:cstheme="majorHAnsi"/>
+                <w:b/>
+                <w:bCs/>
+                <w:sz w:val="28"/>
+                <w:szCs w:val="28"/>
+              </w:rPr>
+            </w:pPr>
+            <w:r>
+              <w:rPr>
+                <w:rFonts w:asciiTheme="majorHAnsi" w:hAnsiTheme="majorHAnsi" w:cstheme="majorHAnsi"/>
+                <w:b/>
+                <w:bCs/>
+                <w:sz w:val="28"/>
+                <w:szCs w:val="28"/>
+              </w:rPr>
+              <w:t>Trường thông tin</w:t>
+            </w:r>
+          </w:p>
+        </w:tc>
+        <w:tc>
+          <w:tcPr>
+            <w:tcW w:w="5193" w:type="dxa"/>
+            <w:vAlign w:val="center"/>
+          </w:tcPr>
+          <w:p>
+            <w:pPr>
+              <w:jc w:val="center"/>
+              <w:rPr>
+                <w:rFonts w:asciiTheme="majorHAnsi" w:hAnsiTheme="majorHAnsi" w:cstheme="majorHAnsi"/>
+                <w:b/>
+                <w:bCs/>
+                <w:sz w:val="28"/>
+                <w:szCs w:val="28"/>
+              </w:rPr>
+            </w:pPr>
+            <w:r>
+              <w:rPr>
+                <w:rFonts w:asciiTheme="majorHAnsi" w:hAnsiTheme="majorHAnsi" w:cstheme="majorHAnsi"/>
+                <w:b/>
+                <w:bCs/>
+                <w:sz w:val="28"/>
+                <w:szCs w:val="28"/>
+              </w:rPr>
+              <w:t>Dữ liệu mẫu</w:t>
+            </w:r>
+          </w:p>
+        </w:tc>
+      </w:tr>
+      <w:tr>
+        <w:trPr>
+          <w:trHeight w:val="798"/>
+        </w:trPr>
+        <w:tc>
+          <w:tcPr>
+            <w:tcW w:w="1413" w:type="dxa"/>
+            <w:vMerge w:val="restart"/>
+            <w:vAlign w:val="center"/>
+          </w:tcPr>
+          <w:p>
+            <w:pPr>
+              <w:jc w:val="center"/>
+              <w:rPr>
+                <w:rFonts w:asciiTheme="majorHAnsi" w:hAnsiTheme="majorHAnsi" w:cstheme="majorHAnsi"/>
+                <w:b/>
+                <w:bCs/>
+                <w:sz w:val="28"/>
+                <w:szCs w:val="28"/>
+              </w:rPr>
+            </w:pPr>
+            <w:r>
+              <w:rPr>
+                <w:rFonts w:asciiTheme="majorHAnsi" w:hAnsiTheme="majorHAnsi" w:cstheme="majorHAnsi"/>
+                <w:b/>
+                <w:bCs/>
+                <w:sz w:val="28"/>
+                <w:szCs w:val="28"/>
+              </w:rPr>
+              <w:t>Thông tin chung</w:t>
+            </w:r>
+          </w:p>
+        </w:tc>
+        <w:tc>
+          <w:tcPr>
+            <w:tcW w:w="2410" w:type="dxa"/>
+            <w:vAlign w:val="center"/>
+          </w:tcPr>
+          <w:p>
+            <w:pPr>
+              <w:rPr>
+                <w:rFonts w:asciiTheme="majorHAnsi" w:hAnsiTheme="majorHAnsi" w:cstheme="majorHAnsi"/>
+                <w:sz w:val="28"/>
+                <w:szCs w:val="28"/>
+              </w:rPr>
+            </w:pPr>
+            <w:r>
+              <w:rPr>
+                <w:rFonts w:asciiTheme="majorHAnsi" w:hAnsiTheme="majorHAnsi" w:cstheme="majorHAnsi"/>
+                <w:sz w:val="28"/>
+                <w:szCs w:val="28"/>
+              </w:rPr>
+              <w:t xml:space="preserve">Tiêu </w:t>
+            </w:r>
+            <w:r>
+              <w:rPr>
+                <w:rFonts w:asciiTheme="majorHAnsi" w:hAnsiTheme="majorHAnsi" w:cstheme="majorHAnsi"/>
+                <w:sz w:val="28"/>
+                <w:szCs w:val="28"/>
+              </w:rPr>
+              <w:t>đề</w:t>
+            </w:r>
+          </w:p>
+        </w:tc>
+        <w:tc>
+          <w:tcPr>
+            <w:tcW w:w="5193" w:type="dxa"/>
+            <w:vAlign w:val="center"/>
+          </w:tcPr>
+          <w:p>
+            <w:pPr>
+              <w:rPr>
+                <w:rFonts w:asciiTheme="majorHAnsi" w:hAnsiTheme="majorHAnsi" w:cstheme="majorHAnsi"/>
+                <w:sz w:val="28"/>
+                <w:szCs w:val="28"/>
+              </w:rPr>
+            </w:pPr>
+            <w:r>
+              <w:rPr>
+                <w:rFonts w:asciiTheme="majorHAnsi" w:hAnsiTheme="majorHAnsi" w:cstheme="majorHAnsi"/>
+                <w:sz w:val="28"/>
+                <w:szCs w:val="28"/>
+              </w:rPr>
+              <w:t>Lập Trình Java Cơ Bản Cho Người Mới Bắt Đầu</w:t>
+            </w:r>
+          </w:p>
+        </w:tc>
+      </w:tr>
+      <w:tr>
+        <w:trPr>
+          <w:trHeight w:val="1122"/>
+        </w:trPr>
+        <w:tc>
+          <w:tcPr>
+            <w:tcW w:w="1413" w:type="dxa"/>
+            <w:vMerge/>
+            <w:vAlign w:val="center"/>
+          </w:tcPr>
+          <w:p>
+            <w:pPr>
+              <w:jc w:val="center"/>
+              <w:rPr>
+                <w:rFonts w:asciiTheme="majorHAnsi" w:hAnsiTheme="majorHAnsi" w:cstheme="majorHAnsi"/>
+                <w:b/>
+                <w:bCs/>
+                <w:sz w:val="28"/>
+                <w:szCs w:val="28"/>
+              </w:rPr>
+            </w:pPr>
+          </w:p>
+        </w:tc>
+        <w:tc>
+          <w:tcPr>
+            <w:tcW w:w="2410" w:type="dxa"/>
+            <w:vAlign w:val="center"/>
+          </w:tcPr>
+          <w:p>
+            <w:pPr>
+              <w:rPr>
+                <w:rFonts w:asciiTheme="majorHAnsi" w:hAnsiTheme="majorHAnsi" w:cstheme="majorHAnsi"/>
+                <w:sz w:val="28"/>
+                <w:szCs w:val="28"/>
+              </w:rPr>
+            </w:pPr>
+            <w:r>
+              <w:rPr>
+                <w:rFonts w:asciiTheme="majorHAnsi" w:hAnsiTheme="majorHAnsi" w:cstheme="majorHAnsi"/>
+                <w:sz w:val="28"/>
+                <w:szCs w:val="28"/>
+              </w:rPr>
+              <w:t xml:space="preserve">Mô </w:t>
+            </w:r>
+            <w:r>
+              <w:rPr>
+                <w:rFonts w:asciiTheme="majorHAnsi" w:hAnsiTheme="majorHAnsi" w:cstheme="majorHAnsi"/>
+                <w:sz w:val="28"/>
+                <w:szCs w:val="28"/>
+              </w:rPr>
+              <w:t>tả</w:t>
+            </w:r>
+          </w:p>
+        </w:tc>
+        <w:tc>
+          <w:tcPr>
+            <w:tcW w:w="5193" w:type="dxa"/>
+            <w:vAlign w:val="center"/>
+          </w:tcPr>
+          <w:p>
+            <w:pPr>
+              <w:rPr>
+                <w:rFonts w:asciiTheme="majorHAnsi" w:hAnsiTheme="majorHAnsi" w:cstheme="majorHAnsi"/>
+                <w:sz w:val="28"/>
+                <w:szCs w:val="28"/>
+              </w:rPr>
+            </w:pPr>
+            <w:r>
+              <w:rPr>
+                <w:rFonts w:asciiTheme="majorHAnsi" w:hAnsiTheme="majorHAnsi" w:cstheme="majorHAnsi"/>
+                <w:sz w:val="28"/>
+                <w:szCs w:val="28"/>
+              </w:rPr>
+              <w:t>Khóa học giúp bạn làm quen với lập trình Java, từ cú pháp cơ bản đến ứng dụng nhỏ đầu tiên.</w:t>
+            </w:r>
+          </w:p>
+        </w:tc>
+      </w:tr>
+      <w:tr>
+        <w:trPr>
+          <w:trHeight w:val="699"/>
+        </w:trPr>
+        <w:tc>
+          <w:tcPr>
+            <w:tcW w:w="1413" w:type="dxa"/>
+            <w:vMerge/>
+            <w:vAlign w:val="center"/>
+          </w:tcPr>
+          <w:p>
+            <w:pPr>
+              <w:jc w:val="center"/>
+              <w:rPr>
+                <w:rFonts w:asciiTheme="majorHAnsi" w:hAnsiTheme="majorHAnsi" w:cstheme="majorHAnsi"/>
+                <w:b/>
+                <w:bCs/>
+                <w:sz w:val="28"/>
+                <w:szCs w:val="28"/>
+              </w:rPr>
+            </w:pPr>
+          </w:p>
+        </w:tc>
+        <w:tc>
+          <w:tcPr>
+            <w:tcW w:w="2410" w:type="dxa"/>
+            <w:vAlign w:val="center"/>
+          </w:tcPr>
+          <w:p>
+            <w:pPr>
+              <w:rPr>
+                <w:rFonts w:asciiTheme="majorHAnsi" w:hAnsiTheme="majorHAnsi" w:cstheme="majorHAnsi"/>
+                <w:sz w:val="28"/>
+                <w:szCs w:val="28"/>
+              </w:rPr>
+            </w:pPr>
+            <w:r>
+              <w:rPr>
+                <w:rFonts w:asciiTheme="majorHAnsi" w:hAnsiTheme="majorHAnsi" w:cstheme="majorHAnsi"/>
+                <w:sz w:val="28"/>
+                <w:szCs w:val="28"/>
+              </w:rPr>
+              <w:t>Video Giới Thiệu</w:t>
+            </w:r>
+          </w:p>
+        </w:tc>
+        <w:tc>
+          <w:tcPr>
+            <w:tcW w:w="5193" w:type="dxa"/>
+            <w:vAlign w:val="center"/>
+          </w:tcPr>
+          <w:p>
+            <w:pPr>
+              <w:rPr>
+                <w:rFonts w:asciiTheme="majorHAnsi" w:hAnsiTheme="majorHAnsi" w:cstheme="majorHAnsi"/>
+                <w:bCs/>
+                <w:sz w:val="20"/>
+                <w:szCs w:val="20"/>
+              </w:rPr>
+            </w:pPr>
+            <w:hyperlink r:id="rId7" w:history="1">
+              <w:r>
+                <w:rPr>
+                  <w:rStyle w:val="Hyperlink"/>
+                  <w:rFonts w:asciiTheme="majorHAnsi" w:hAnsiTheme="majorHAnsi" w:cstheme="majorHAnsi"/>
+                  <w:bCs/>
+                  <w:sz w:val="20"/>
+                  <w:szCs w:val="20"/>
+                </w:rPr>
+                <w:t>https://www.youtube.com/watch?v=l9AzO1FMgM8&amp;t=</w:t>
+              </w:r>
+              <w:r>
+                <w:rPr>
+                  <w:rStyle w:val="Hyperlink"/>
+                  <w:rFonts w:asciiTheme="majorHAnsi" w:hAnsiTheme="majorHAnsi" w:cstheme="majorHAnsi"/>
+                  <w:bCs/>
+                  <w:sz w:val="20"/>
+                  <w:szCs w:val="20"/>
+                </w:rPr>
+                <w:t>2</w:t>
+              </w:r>
+              <w:r>
+                <w:rPr>
+                  <w:rStyle w:val="Hyperlink"/>
+                  <w:rFonts w:asciiTheme="majorHAnsi" w:hAnsiTheme="majorHAnsi" w:cstheme="majorHAnsi"/>
+                  <w:bCs/>
+                  <w:sz w:val="20"/>
+                  <w:szCs w:val="20"/>
+                </w:rPr>
+                <w:t>2s</w:t>
+              </w:r>
+            </w:hyperlink>
+          </w:p>
+        </w:tc>
+      </w:tr>
+      <w:tr>
+        <w:tc>
+          <w:tcPr>
+            <w:tcW w:w="1413" w:type="dxa"/>
+            <w:vMerge/>
+            <w:vAlign w:val="center"/>
+          </w:tcPr>
+          <w:p>
+            <w:pPr>
+              <w:jc w:val="center"/>
+              <w:rPr>
+                <w:rFonts w:asciiTheme="majorHAnsi" w:hAnsiTheme="majorHAnsi" w:cstheme="majorHAnsi"/>
+                <w:b/>
+                <w:bCs/>
+                <w:sz w:val="28"/>
+                <w:szCs w:val="28"/>
+              </w:rPr>
+            </w:pPr>
+          </w:p>
+        </w:tc>
+        <w:tc>
+          <w:tcPr>
+            <w:tcW w:w="2410" w:type="dxa"/>
+            <w:vAlign w:val="center"/>
+          </w:tcPr>
+          <w:p>
+            <w:pPr>
+              <w:rPr>
+                <w:rFonts w:asciiTheme="majorHAnsi" w:hAnsiTheme="majorHAnsi" w:cstheme="majorHAnsi"/>
+                <w:sz w:val="28"/>
+                <w:szCs w:val="28"/>
+              </w:rPr>
+            </w:pPr>
+            <w:r>
+              <w:rPr>
+                <w:rFonts w:asciiTheme="majorHAnsi" w:hAnsiTheme="majorHAnsi" w:cstheme="majorHAnsi"/>
+                <w:sz w:val="28"/>
+                <w:szCs w:val="28"/>
+              </w:rPr>
+              <w:t>Nội Dung Chi Tiết</w:t>
+            </w:r>
+          </w:p>
+        </w:tc>
+        <w:tc>
+          <w:tcPr>
+            <w:tcW w:w="5193" w:type="dxa"/>
+            <w:vAlign w:val="center"/>
+          </w:tcPr>
+          <w:p>
+            <w:pPr>
+              <w:rPr>
+                <w:rFonts w:asciiTheme="majorHAnsi" w:hAnsiTheme="majorHAnsi" w:cstheme="majorHAnsi"/>
+                <w:sz w:val="28"/>
+                <w:szCs w:val="28"/>
+              </w:rPr>
+            </w:pPr>
+            <w:r>
+              <w:rPr>
+                <w:rFonts w:asciiTheme="majorHAnsi" w:hAnsiTheme="majorHAnsi" w:cstheme="majorHAnsi"/>
+                <w:sz w:val="28"/>
+                <w:szCs w:val="28"/>
+              </w:rPr>
+              <w:t>&lt;ul&gt;</w:t>
+            </w:r>
+          </w:p>
+          <w:p>
+            <w:pPr>
+              <w:rPr>
+                <w:rFonts w:asciiTheme="majorHAnsi" w:hAnsiTheme="majorHAnsi" w:cstheme="majorHAnsi"/>
+                <w:sz w:val="28"/>
+                <w:szCs w:val="28"/>
+              </w:rPr>
+            </w:pPr>
+            <w:r>
+              <w:rPr>
+                <w:rFonts w:asciiTheme="majorHAnsi" w:hAnsiTheme="majorHAnsi" w:cstheme="majorHAnsi"/>
+                <w:sz w:val="28"/>
+                <w:szCs w:val="28"/>
+              </w:rPr>
+              <w:t xml:space="preserve">    &lt;li&gt;</w:t>
+            </w:r>
+            <w:r>
+              <w:rPr>
+                <w:rFonts w:ascii="Segoe UI Emoji" w:hAnsi="Segoe UI Emoji" w:cs="Segoe UI Emoji"/>
+                <w:sz w:val="28"/>
+                <w:szCs w:val="28"/>
+              </w:rPr>
+              <w:t>✅</w:t>
+            </w:r>
+            <w:r>
+              <w:rPr>
+                <w:rFonts w:asciiTheme="majorHAnsi" w:hAnsiTheme="majorHAnsi" w:cstheme="majorHAnsi"/>
+                <w:sz w:val="28"/>
+                <w:szCs w:val="28"/>
+              </w:rPr>
+              <w:t xml:space="preserve"> Giới thiệu về Java và cài đặt môi trường phát triển&lt;/li&gt;</w:t>
+            </w:r>
+          </w:p>
+          <w:p>
+            <w:pPr>
+              <w:rPr>
+                <w:rFonts w:asciiTheme="majorHAnsi" w:hAnsiTheme="majorHAnsi" w:cstheme="majorHAnsi"/>
+                <w:sz w:val="28"/>
+                <w:szCs w:val="28"/>
+              </w:rPr>
+            </w:pPr>
+            <w:r>
+              <w:rPr>
+                <w:rFonts w:asciiTheme="majorHAnsi" w:hAnsiTheme="majorHAnsi" w:cstheme="majorHAnsi"/>
+                <w:sz w:val="28"/>
+                <w:szCs w:val="28"/>
+              </w:rPr>
+              <w:t xml:space="preserve">    &lt;li&gt;</w:t>
+            </w:r>
+            <w:r>
+              <w:rPr>
+                <w:rFonts w:ascii="Segoe UI Emoji" w:hAnsi="Segoe UI Emoji" w:cs="Segoe UI Emoji"/>
+                <w:sz w:val="28"/>
+                <w:szCs w:val="28"/>
+              </w:rPr>
+              <w:t>✅</w:t>
+            </w:r>
+            <w:r>
+              <w:rPr>
+                <w:rFonts w:asciiTheme="majorHAnsi" w:hAnsiTheme="majorHAnsi" w:cstheme="majorHAnsi"/>
+                <w:sz w:val="28"/>
+                <w:szCs w:val="28"/>
+              </w:rPr>
+              <w:t xml:space="preserve"> Biến, kiểu dữ liệu và toán tử&lt;/li&gt;</w:t>
+            </w:r>
+          </w:p>
+          <w:p>
+            <w:pPr>
+              <w:rPr>
+                <w:rFonts w:asciiTheme="majorHAnsi" w:hAnsiTheme="majorHAnsi" w:cstheme="majorHAnsi"/>
+                <w:sz w:val="28"/>
+                <w:szCs w:val="28"/>
+              </w:rPr>
+            </w:pPr>
+            <w:r>
+              <w:rPr>
+                <w:rFonts w:asciiTheme="majorHAnsi" w:hAnsiTheme="majorHAnsi" w:cstheme="majorHAnsi"/>
+                <w:sz w:val="28"/>
+                <w:szCs w:val="28"/>
+              </w:rPr>
+              <w:t xml:space="preserve">    &lt;li&gt;</w:t>
+            </w:r>
+            <w:r>
+              <w:rPr>
+                <w:rFonts w:ascii="Segoe UI Emoji" w:hAnsi="Segoe UI Emoji" w:cs="Segoe UI Emoji"/>
+                <w:sz w:val="28"/>
+                <w:szCs w:val="28"/>
+              </w:rPr>
+              <w:t>✅</w:t>
+            </w:r>
+            <w:r>
+              <w:rPr>
+                <w:rFonts w:asciiTheme="majorHAnsi" w:hAnsiTheme="majorHAnsi" w:cstheme="majorHAnsi"/>
+                <w:sz w:val="28"/>
+                <w:szCs w:val="28"/>
+              </w:rPr>
+              <w:t xml:space="preserve"> Cấu trúc điều khiển: if, switch, vòng lặp&lt;/li&gt;</w:t>
+            </w:r>
+          </w:p>
+          <w:p>
+            <w:pPr>
+              <w:rPr>
+                <w:rFonts w:asciiTheme="majorHAnsi" w:hAnsiTheme="majorHAnsi" w:cstheme="majorHAnsi"/>
+                <w:sz w:val="28"/>
+                <w:szCs w:val="28"/>
+              </w:rPr>
+            </w:pPr>
+            <w:r>
+              <w:rPr>
+                <w:rFonts w:asciiTheme="majorHAnsi" w:hAnsiTheme="majorHAnsi" w:cstheme="majorHAnsi"/>
+                <w:sz w:val="28"/>
+                <w:szCs w:val="28"/>
+              </w:rPr>
+              <w:t xml:space="preserve">    &lt;li&gt;</w:t>
+            </w:r>
+            <w:r>
+              <w:rPr>
+                <w:rFonts w:ascii="Segoe UI Emoji" w:hAnsi="Segoe UI Emoji" w:cs="Segoe UI Emoji"/>
+                <w:sz w:val="28"/>
+                <w:szCs w:val="28"/>
+              </w:rPr>
+              <w:t>✅</w:t>
+            </w:r>
+            <w:r>
+              <w:rPr>
+                <w:rFonts w:asciiTheme="majorHAnsi" w:hAnsiTheme="majorHAnsi" w:cstheme="majorHAnsi"/>
+                <w:sz w:val="28"/>
+                <w:szCs w:val="28"/>
+              </w:rPr>
+              <w:t xml:space="preserve"> Lập trình hướng đối tượng: class, object, kế thừa, đa hình&lt;/li&gt;</w:t>
+            </w:r>
+          </w:p>
+          <w:p>
+            <w:pPr>
+              <w:rPr>
+                <w:rFonts w:asciiTheme="majorHAnsi" w:hAnsiTheme="majorHAnsi" w:cstheme="majorHAnsi"/>
+                <w:sz w:val="28"/>
+                <w:szCs w:val="28"/>
+              </w:rPr>
+            </w:pPr>
+            <w:r>
+              <w:rPr>
+                <w:rFonts w:asciiTheme="majorHAnsi" w:hAnsiTheme="majorHAnsi" w:cstheme="majorHAnsi"/>
+                <w:sz w:val="28"/>
+                <w:szCs w:val="28"/>
+              </w:rPr>
+              <w:t xml:space="preserve">    &lt;li&gt;</w:t>
+            </w:r>
+            <w:r>
+              <w:rPr>
+                <w:rFonts w:ascii="Segoe UI Emoji" w:hAnsi="Segoe UI Emoji" w:cs="Segoe UI Emoji"/>
+                <w:sz w:val="28"/>
+                <w:szCs w:val="28"/>
+              </w:rPr>
+              <w:t>✅</w:t>
+            </w:r>
+            <w:r>
+              <w:rPr>
+                <w:rFonts w:asciiTheme="majorHAnsi" w:hAnsiTheme="majorHAnsi" w:cstheme="majorHAnsi"/>
+                <w:sz w:val="28"/>
+                <w:szCs w:val="28"/>
+              </w:rPr>
+              <w:t xml:space="preserve"> L</w:t>
+            </w:r>
+            <w:r>
+              <w:rPr>
+                <w:rFonts w:ascii="Times New Roman" w:hAnsi="Times New Roman" w:cs="Times New Roman"/>
+                <w:sz w:val="28"/>
+                <w:szCs w:val="28"/>
+              </w:rPr>
+              <w:t>à</w:t>
+            </w:r>
+            <w:r>
+              <w:rPr>
+                <w:rFonts w:asciiTheme="majorHAnsi" w:hAnsiTheme="majorHAnsi" w:cstheme="majorHAnsi"/>
+                <w:sz w:val="28"/>
+                <w:szCs w:val="28"/>
+              </w:rPr>
+              <w:t>m việc với mảng và collection&lt;/li&gt;</w:t>
+            </w:r>
+          </w:p>
+          <w:p>
+            <w:pPr>
+              <w:rPr>
+                <w:rFonts w:asciiTheme="majorHAnsi" w:hAnsiTheme="majorHAnsi" w:cstheme="majorHAnsi"/>
+                <w:sz w:val="28"/>
+                <w:szCs w:val="28"/>
+              </w:rPr>
+            </w:pPr>
+            <w:r>
+              <w:rPr>
+                <w:rFonts w:asciiTheme="majorHAnsi" w:hAnsiTheme="majorHAnsi" w:cstheme="majorHAnsi"/>
+                <w:sz w:val="28"/>
+                <w:szCs w:val="28"/>
+              </w:rPr>
+              <w:t xml:space="preserve">    &lt;li&gt;</w:t>
+            </w:r>
+            <w:r>
+              <w:rPr>
+                <w:rFonts w:ascii="Segoe UI Emoji" w:hAnsi="Segoe UI Emoji" w:cs="Segoe UI Emoji"/>
+                <w:sz w:val="28"/>
+                <w:szCs w:val="28"/>
+              </w:rPr>
+              <w:t>✅</w:t>
+            </w:r>
+            <w:r>
+              <w:rPr>
+                <w:rFonts w:asciiTheme="majorHAnsi" w:hAnsiTheme="majorHAnsi" w:cstheme="majorHAnsi"/>
+                <w:sz w:val="28"/>
+                <w:szCs w:val="28"/>
+              </w:rPr>
+              <w:t xml:space="preserve"> Xử lý ngoại lệ và debug&lt;/li&gt;</w:t>
+            </w:r>
+          </w:p>
+          <w:p>
+            <w:pPr>
+              <w:rPr>
+                <w:rFonts w:asciiTheme="majorHAnsi" w:hAnsiTheme="majorHAnsi" w:cstheme="majorHAnsi"/>
+                <w:sz w:val="28"/>
+                <w:szCs w:val="28"/>
+              </w:rPr>
+            </w:pPr>
+            <w:r>
+              <w:rPr>
+                <w:rFonts w:asciiTheme="majorHAnsi" w:hAnsiTheme="majorHAnsi" w:cstheme="majorHAnsi"/>
+                <w:sz w:val="28"/>
+                <w:szCs w:val="28"/>
+              </w:rPr>
+              <w:t xml:space="preserve">    &lt;li&gt;</w:t>
+            </w:r>
+            <w:r>
+              <w:rPr>
+                <w:rFonts w:ascii="Segoe UI Emoji" w:hAnsi="Segoe UI Emoji" w:cs="Segoe UI Emoji"/>
+                <w:sz w:val="28"/>
+                <w:szCs w:val="28"/>
+              </w:rPr>
+              <w:t>✅</w:t>
+            </w:r>
+            <w:r>
+              <w:rPr>
+                <w:rFonts w:asciiTheme="majorHAnsi" w:hAnsiTheme="majorHAnsi" w:cstheme="majorHAnsi"/>
+                <w:sz w:val="28"/>
+                <w:szCs w:val="28"/>
+              </w:rPr>
+              <w:t xml:space="preserve"> Viết ứng dụng Java nhỏ cuối khóa&lt;/li&gt;</w:t>
+            </w:r>
+          </w:p>
+          <w:p>
+            <w:pPr>
+              <w:rPr>
+                <w:rFonts w:asciiTheme="majorHAnsi" w:hAnsiTheme="majorHAnsi" w:cstheme="majorHAnsi"/>
+                <w:sz w:val="28"/>
+                <w:szCs w:val="28"/>
+              </w:rPr>
+            </w:pPr>
+            <w:r>
+              <w:rPr>
+                <w:rFonts w:asciiTheme="majorHAnsi" w:hAnsiTheme="majorHAnsi" w:cstheme="majorHAnsi"/>
+                <w:sz w:val="28"/>
+                <w:szCs w:val="28"/>
+              </w:rPr>
+              <w:t>&lt;/ul&gt;</w:t>
+            </w:r>
+          </w:p>
+        </w:tc>
+      </w:tr>
+      <w:tr>
+        <w:trPr>
+          <w:trHeight w:val="513"/>
+        </w:trPr>
+        <w:tc>
+          <w:tcPr>
+            <w:tcW w:w="1413" w:type="dxa"/>
+            <w:vMerge/>
+            <w:vAlign w:val="center"/>
+          </w:tcPr>
+          <w:p>
+            <w:pPr>
+              <w:jc w:val="center"/>
+              <w:rPr>
+                <w:rFonts w:asciiTheme="majorHAnsi" w:hAnsiTheme="majorHAnsi" w:cstheme="majorHAnsi"/>
+                <w:b/>
+                <w:bCs/>
+                <w:sz w:val="28"/>
+                <w:szCs w:val="28"/>
+              </w:rPr>
+            </w:pPr>
+          </w:p>
+        </w:tc>
+        <w:tc>
+          <w:tcPr>
+            <w:tcW w:w="2410" w:type="dxa"/>
+            <w:vAlign w:val="center"/>
+          </w:tcPr>
+          <w:p>
+            <w:pPr>
+              <w:rPr>
+                <w:rFonts w:asciiTheme="majorHAnsi" w:hAnsiTheme="majorHAnsi" w:cstheme="majorHAnsi"/>
+                <w:sz w:val="28"/>
+                <w:szCs w:val="28"/>
+              </w:rPr>
+            </w:pPr>
+            <w:r>
+              <w:rPr>
+                <w:rFonts w:asciiTheme="majorHAnsi" w:hAnsiTheme="majorHAnsi" w:cstheme="majorHAnsi"/>
+                <w:sz w:val="28"/>
+                <w:szCs w:val="28"/>
+              </w:rPr>
+              <w:t>Trình độ</w:t>
+            </w:r>
+          </w:p>
+        </w:tc>
+        <w:tc>
+          <w:tcPr>
+            <w:tcW w:w="5193" w:type="dxa"/>
+            <w:vAlign w:val="center"/>
+          </w:tcPr>
+          <w:p>
+            <w:pPr>
+              <w:rPr>
+                <w:rFonts w:asciiTheme="majorHAnsi" w:hAnsiTheme="majorHAnsi" w:cstheme="majorHAnsi"/>
+                <w:sz w:val="28"/>
+                <w:szCs w:val="28"/>
+              </w:rPr>
+            </w:pPr>
+            <w:r>
+              <w:rPr>
+                <w:rFonts w:asciiTheme="majorHAnsi" w:hAnsiTheme="majorHAnsi" w:cstheme="majorHAnsi"/>
+                <w:sz w:val="28"/>
+                <w:szCs w:val="28"/>
+              </w:rPr>
+              <w:t>Cơ bản</w:t>
+            </w:r>
+          </w:p>
+        </w:tc>
+      </w:tr>
+      <w:tr>
+        <w:trPr>
+          <w:trHeight w:val="548"/>
+        </w:trPr>
+        <w:tc>
+          <w:tcPr>
+            <w:tcW w:w="1413" w:type="dxa"/>
+            <w:vMerge/>
+            <w:vAlign w:val="center"/>
+          </w:tcPr>
+          <w:p>
+            <w:pPr>
+              <w:jc w:val="center"/>
+              <w:rPr>
+                <w:rFonts w:asciiTheme="majorHAnsi" w:hAnsiTheme="majorHAnsi" w:cstheme="majorHAnsi"/>
+                <w:b/>
+                <w:bCs/>
+                <w:sz w:val="28"/>
+                <w:szCs w:val="28"/>
+              </w:rPr>
+            </w:pPr>
+          </w:p>
+        </w:tc>
+        <w:tc>
+          <w:tcPr>
+            <w:tcW w:w="2410" w:type="dxa"/>
+            <w:vAlign w:val="center"/>
+          </w:tcPr>
+          <w:p>
+            <w:pPr>
+              <w:rPr>
+                <w:rFonts w:asciiTheme="majorHAnsi" w:hAnsiTheme="majorHAnsi" w:cstheme="majorHAnsi"/>
+                <w:sz w:val="28"/>
+                <w:szCs w:val="28"/>
+              </w:rPr>
+            </w:pPr>
+            <w:r>
+              <w:rPr>
+                <w:rFonts w:asciiTheme="majorHAnsi" w:hAnsiTheme="majorHAnsi" w:cstheme="majorHAnsi"/>
+                <w:sz w:val="28"/>
+                <w:szCs w:val="28"/>
+              </w:rPr>
+              <w:t>Ngôn ngữ</w:t>
+            </w:r>
+          </w:p>
+        </w:tc>
+        <w:tc>
+          <w:tcPr>
+            <w:tcW w:w="5193" w:type="dxa"/>
+            <w:vAlign w:val="center"/>
+          </w:tcPr>
+          <w:p>
+            <w:pPr>
+              <w:rPr>
+                <w:rFonts w:asciiTheme="majorHAnsi" w:hAnsiTheme="majorHAnsi" w:cstheme="majorHAnsi"/>
+                <w:sz w:val="28"/>
+                <w:szCs w:val="28"/>
+              </w:rPr>
+            </w:pPr>
+            <w:r>
+              <w:rPr>
+                <w:rFonts w:asciiTheme="majorHAnsi" w:hAnsiTheme="majorHAnsi" w:cstheme="majorHAnsi"/>
+                <w:sz w:val="28"/>
+                <w:szCs w:val="28"/>
+              </w:rPr>
+              <w:t>Tiếng việt</w:t>
+            </w:r>
+          </w:p>
+        </w:tc>
+      </w:tr>
+      <w:tr>
+        <w:trPr>
+          <w:trHeight w:val="556"/>
+        </w:trPr>
+        <w:tc>
+          <w:tcPr>
+            <w:tcW w:w="1413" w:type="dxa"/>
+            <w:vMerge/>
+            <w:vAlign w:val="center"/>
+          </w:tcPr>
+          <w:p>
+            <w:pPr>
+              <w:jc w:val="center"/>
+              <w:rPr>
+                <w:rFonts w:asciiTheme="majorHAnsi" w:hAnsiTheme="majorHAnsi" w:cstheme="majorHAnsi"/>
+                <w:b/>
+                <w:bCs/>
+                <w:sz w:val="28"/>
+                <w:szCs w:val="28"/>
+              </w:rPr>
+            </w:pPr>
+          </w:p>
+        </w:tc>
+        <w:tc>
+          <w:tcPr>
+            <w:tcW w:w="2410" w:type="dxa"/>
+            <w:vAlign w:val="center"/>
+          </w:tcPr>
+          <w:p>
+            <w:pPr>
+              <w:rPr>
+                <w:rFonts w:asciiTheme="majorHAnsi" w:hAnsiTheme="majorHAnsi" w:cstheme="majorHAnsi"/>
+                <w:sz w:val="28"/>
+                <w:szCs w:val="28"/>
+              </w:rPr>
+            </w:pPr>
+            <w:r>
+              <w:rPr>
+                <w:rFonts w:asciiTheme="majorHAnsi" w:hAnsiTheme="majorHAnsi" w:cstheme="majorHAnsi"/>
+                <w:sz w:val="28"/>
+                <w:szCs w:val="28"/>
+              </w:rPr>
+              <w:t>Danh mục</w:t>
+            </w:r>
+          </w:p>
+        </w:tc>
+        <w:tc>
+          <w:tcPr>
+            <w:tcW w:w="5193" w:type="dxa"/>
+            <w:vAlign w:val="center"/>
+          </w:tcPr>
+          <w:p>
+            <w:pPr>
+              <w:rPr>
+                <w:rFonts w:asciiTheme="majorHAnsi" w:hAnsiTheme="majorHAnsi" w:cstheme="majorHAnsi"/>
+                <w:sz w:val="28"/>
+                <w:szCs w:val="28"/>
+              </w:rPr>
+            </w:pPr>
+            <w:r>
+              <w:rPr>
+                <w:rFonts w:asciiTheme="majorHAnsi" w:hAnsiTheme="majorHAnsi" w:cstheme="majorHAnsi"/>
+                <w:sz w:val="28"/>
+                <w:szCs w:val="28"/>
+              </w:rPr>
+              <w:t>Programing</w:t>
+            </w:r>
+          </w:p>
+        </w:tc>
+      </w:tr>
+      <w:tr>
+        <w:trPr>
+          <w:trHeight w:val="550"/>
+        </w:trPr>
+        <w:tc>
+          <w:tcPr>
+            <w:tcW w:w="1413" w:type="dxa"/>
+            <w:vMerge/>
+            <w:vAlign w:val="center"/>
+          </w:tcPr>
+          <w:p>
+            <w:pPr>
+              <w:jc w:val="center"/>
+              <w:rPr>
+                <w:rFonts w:asciiTheme="majorHAnsi" w:hAnsiTheme="majorHAnsi" w:cstheme="majorHAnsi"/>
+                <w:b/>
+                <w:bCs/>
+                <w:sz w:val="28"/>
+                <w:szCs w:val="28"/>
+              </w:rPr>
+            </w:pPr>
+          </w:p>
+        </w:tc>
+        <w:tc>
+          <w:tcPr>
+            <w:tcW w:w="2410" w:type="dxa"/>
+            <w:vAlign w:val="center"/>
+          </w:tcPr>
+          <w:p>
+            <w:pPr>
+              <w:rPr>
+                <w:rFonts w:asciiTheme="majorHAnsi" w:hAnsiTheme="majorHAnsi" w:cstheme="majorHAnsi"/>
+                <w:sz w:val="28"/>
+                <w:szCs w:val="28"/>
+              </w:rPr>
+            </w:pPr>
+            <w:r>
+              <w:rPr>
+                <w:rFonts w:asciiTheme="majorHAnsi" w:hAnsiTheme="majorHAnsi" w:cstheme="majorHAnsi"/>
+                <w:sz w:val="28"/>
+                <w:szCs w:val="28"/>
+              </w:rPr>
+              <w:t>Cấp chứng chỉ</w:t>
+            </w:r>
+          </w:p>
+        </w:tc>
+        <w:tc>
+          <w:tcPr>
+            <w:tcW w:w="5193" w:type="dxa"/>
+            <w:vAlign w:val="center"/>
+          </w:tcPr>
+          <w:p>
+            <w:pPr>
+              <w:rPr>
+                <w:rFonts w:asciiTheme="majorHAnsi" w:hAnsiTheme="majorHAnsi" w:cstheme="majorHAnsi"/>
+                <w:sz w:val="28"/>
+                <w:szCs w:val="28"/>
+              </w:rPr>
+            </w:pPr>
+            <w:r>
+              <w:rPr>
+                <w:rFonts w:asciiTheme="majorHAnsi" w:hAnsiTheme="majorHAnsi" w:cstheme="majorHAnsi"/>
+                <w:sz w:val="28"/>
+                <w:szCs w:val="28"/>
+              </w:rPr>
+              <w:t>Có cấp chứng chỉ</w:t>
+            </w:r>
+          </w:p>
+        </w:tc>
+      </w:tr>
+      <w:tr>
+        <w:trPr>
+          <w:trHeight w:val="558"/>
+        </w:trPr>
+        <w:tc>
+          <w:tcPr>
+            <w:tcW w:w="1413" w:type="dxa"/>
+            <w:vMerge/>
+            <w:vAlign w:val="center"/>
+          </w:tcPr>
+          <w:p>
+            <w:pPr>
+              <w:jc w:val="center"/>
+              <w:rPr>
+                <w:rFonts w:asciiTheme="majorHAnsi" w:hAnsiTheme="majorHAnsi" w:cstheme="majorHAnsi"/>
+                <w:b/>
+                <w:bCs/>
+                <w:sz w:val="28"/>
+                <w:szCs w:val="28"/>
+              </w:rPr>
+            </w:pPr>
+          </w:p>
+        </w:tc>
+        <w:tc>
+          <w:tcPr>
+            <w:tcW w:w="2410" w:type="dxa"/>
+            <w:vAlign w:val="center"/>
+          </w:tcPr>
+          <w:p>
+            <w:pPr>
+              <w:rPr>
+                <w:rFonts w:asciiTheme="majorHAnsi" w:hAnsiTheme="majorHAnsi" w:cstheme="majorHAnsi"/>
+                <w:sz w:val="28"/>
+                <w:szCs w:val="28"/>
+              </w:rPr>
+            </w:pPr>
+            <w:r>
+              <w:rPr>
+                <w:rFonts w:asciiTheme="majorHAnsi" w:hAnsiTheme="majorHAnsi" w:cstheme="majorHAnsi"/>
+                <w:sz w:val="28"/>
+                <w:szCs w:val="28"/>
+              </w:rPr>
+              <w:t>Giá khóa học</w:t>
+            </w:r>
+          </w:p>
+        </w:tc>
+        <w:tc>
+          <w:tcPr>
+            <w:tcW w:w="5193" w:type="dxa"/>
+            <w:vAlign w:val="center"/>
+          </w:tcPr>
+          <w:p>
+            <w:pPr>
+              <w:rPr>
+                <w:rFonts w:asciiTheme="majorHAnsi" w:hAnsiTheme="majorHAnsi" w:cstheme="majorHAnsi"/>
+                <w:sz w:val="28"/>
+                <w:szCs w:val="28"/>
+              </w:rPr>
+            </w:pPr>
+            <w:r>
+              <w:rPr>
+                <w:rFonts w:asciiTheme="majorHAnsi" w:hAnsiTheme="majorHAnsi" w:cstheme="majorHAnsi"/>
+                <w:sz w:val="28"/>
+                <w:szCs w:val="28"/>
+              </w:rPr>
+              <w:t>Miễn phí</w:t>
+            </w:r>
+          </w:p>
+        </w:tc>
+      </w:tr>
+      <w:tr>
+        <w:trPr>
+          <w:trHeight w:val="566"/>
+        </w:trPr>
+        <w:tc>
+          <w:tcPr>
+            <w:tcW w:w="1413" w:type="dxa"/>
+            <w:vMerge/>
+            <w:vAlign w:val="center"/>
+          </w:tcPr>
+          <w:p>
+            <w:pPr>
+              <w:jc w:val="center"/>
+              <w:rPr>
+                <w:rFonts w:asciiTheme="majorHAnsi" w:hAnsiTheme="majorHAnsi" w:cstheme="majorHAnsi"/>
+                <w:b/>
+                <w:bCs/>
+                <w:sz w:val="28"/>
+                <w:szCs w:val="28"/>
+              </w:rPr>
+            </w:pPr>
+          </w:p>
+        </w:tc>
+        <w:tc>
+          <w:tcPr>
+            <w:tcW w:w="2410" w:type="dxa"/>
+            <w:vAlign w:val="center"/>
+          </w:tcPr>
+          <w:p>
+            <w:pPr>
+              <w:rPr>
+                <w:rFonts w:asciiTheme="majorHAnsi" w:hAnsiTheme="majorHAnsi" w:cstheme="majorHAnsi"/>
+                <w:sz w:val="28"/>
+                <w:szCs w:val="28"/>
+              </w:rPr>
+            </w:pPr>
+            <w:r>
+              <w:rPr>
+                <w:rFonts w:asciiTheme="majorHAnsi" w:hAnsiTheme="majorHAnsi" w:cstheme="majorHAnsi"/>
+                <w:sz w:val="28"/>
+                <w:szCs w:val="28"/>
+              </w:rPr>
+              <w:t>Ảnh khóa học</w:t>
+            </w:r>
+          </w:p>
+        </w:tc>
+        <w:tc>
+          <w:tcPr>
+            <w:tcW w:w="5193" w:type="dxa"/>
+            <w:vAlign w:val="center"/>
+          </w:tcPr>
+          <w:p>
+            <w:pPr>
+              <w:rPr>
+                <w:rFonts w:asciiTheme="majorHAnsi" w:hAnsiTheme="majorHAnsi" w:cstheme="majorHAnsi"/>
+                <w:sz w:val="28"/>
+                <w:szCs w:val="28"/>
+              </w:rPr>
+            </w:pPr>
+            <w:r>
+              <w:rPr>
+                <w:rFonts w:asciiTheme="majorHAnsi" w:hAnsiTheme="majorHAnsi" w:cstheme="majorHAnsi"/>
+                <w:sz w:val="28"/>
+                <w:szCs w:val="28"/>
+              </w:rPr>
+              <w:t>File hoặc null</w:t>
+            </w:r>
+          </w:p>
+        </w:tc>
+      </w:tr>
+      <w:tr>
+        <w:trPr>
+          <w:trHeight w:val="830"/>
+        </w:trPr>
+        <w:tc>
+          <w:tcPr>
+            <w:tcW w:w="1413" w:type="dxa"/>
+            <w:vAlign w:val="center"/>
+          </w:tcPr>
+          <w:p>
+            <w:pPr>
+              <w:jc w:val="center"/>
+              <w:rPr>
+                <w:rFonts w:asciiTheme="majorHAnsi" w:hAnsiTheme="majorHAnsi" w:cstheme="majorHAnsi"/>
+                <w:b/>
+                <w:bCs/>
+                <w:sz w:val="28"/>
+                <w:szCs w:val="28"/>
+              </w:rPr>
+            </w:pPr>
+            <w:r>
+              <w:rPr>
+                <w:rFonts w:asciiTheme="majorHAnsi" w:hAnsiTheme="majorHAnsi" w:cstheme="majorHAnsi"/>
+                <w:b/>
+                <w:bCs/>
+                <w:sz w:val="28"/>
+                <w:szCs w:val="28"/>
+              </w:rPr>
+              <w:t>Chương 1</w:t>
+            </w:r>
+          </w:p>
+        </w:tc>
+        <w:tc>
+          <w:tcPr>
+            <w:tcW w:w="2410" w:type="dxa"/>
+            <w:vAlign w:val="center"/>
+          </w:tcPr>
+          <w:p>
+            <w:pPr>
+              <w:rPr>
+                <w:rFonts w:asciiTheme="majorHAnsi" w:hAnsiTheme="majorHAnsi" w:cstheme="majorHAnsi"/>
+                <w:sz w:val="28"/>
+                <w:szCs w:val="28"/>
+              </w:rPr>
+            </w:pPr>
+            <w:r>
+              <w:rPr>
+                <w:rFonts w:asciiTheme="majorHAnsi" w:hAnsiTheme="majorHAnsi" w:cstheme="majorHAnsi"/>
+                <w:sz w:val="28"/>
+                <w:szCs w:val="28"/>
+              </w:rPr>
+              <w:t>Tiêu đề chương</w:t>
+            </w:r>
+          </w:p>
+        </w:tc>
+        <w:tc>
+          <w:tcPr>
+            <w:tcW w:w="5193" w:type="dxa"/>
+            <w:vAlign w:val="center"/>
+          </w:tcPr>
+          <w:p>
+            <w:pPr>
+              <w:rPr>
+                <w:rFonts w:asciiTheme="majorHAnsi" w:hAnsiTheme="majorHAnsi" w:cstheme="majorHAnsi"/>
+                <w:sz w:val="28"/>
+                <w:szCs w:val="28"/>
+              </w:rPr>
+            </w:pPr>
+            <w:r>
+              <w:rPr>
+                <w:rFonts w:asciiTheme="majorHAnsi" w:hAnsiTheme="majorHAnsi" w:cstheme="majorHAnsi"/>
+                <w:sz w:val="28"/>
+                <w:szCs w:val="28"/>
+              </w:rPr>
+              <w:t>Giới thiệu về Java và cài đặt môi trường phát triển</w:t>
+            </w:r>
+          </w:p>
+        </w:tc>
+      </w:tr>
+      <w:tr>
+        <w:trPr>
+          <w:trHeight w:val="558"/>
+        </w:trPr>
+        <w:tc>
+          <w:tcPr>
+            <w:tcW w:w="1413" w:type="dxa"/>
+            <w:vMerge w:val="restart"/>
+            <w:vAlign w:val="center"/>
+          </w:tcPr>
+          <w:p>
+            <w:pPr>
+              <w:jc w:val="center"/>
+              <w:rPr>
+                <w:rFonts w:asciiTheme="majorHAnsi" w:hAnsiTheme="majorHAnsi" w:cstheme="majorHAnsi"/>
+                <w:b/>
+                <w:bCs/>
+                <w:sz w:val="28"/>
+                <w:szCs w:val="28"/>
+              </w:rPr>
+            </w:pPr>
+            <w:r>
+              <w:rPr>
+                <w:rFonts w:asciiTheme="majorHAnsi" w:hAnsiTheme="majorHAnsi" w:cstheme="majorHAnsi"/>
+                <w:b/>
+                <w:bCs/>
+                <w:sz w:val="28"/>
+                <w:szCs w:val="28"/>
+              </w:rPr>
+              <w:t>Bài 1</w:t>
+            </w:r>
+          </w:p>
+        </w:tc>
+        <w:tc>
+          <w:tcPr>
+            <w:tcW w:w="2410" w:type="dxa"/>
+            <w:vAlign w:val="center"/>
+          </w:tcPr>
+          <w:p>
+            <w:pPr>
+              <w:rPr>
+                <w:rFonts w:asciiTheme="majorHAnsi" w:hAnsiTheme="majorHAnsi" w:cstheme="majorHAnsi"/>
+                <w:sz w:val="28"/>
+                <w:szCs w:val="28"/>
+              </w:rPr>
+            </w:pPr>
+            <w:r>
+              <w:rPr>
+                <w:rFonts w:asciiTheme="majorHAnsi" w:hAnsiTheme="majorHAnsi" w:cstheme="majorHAnsi"/>
+                <w:sz w:val="28"/>
+                <w:szCs w:val="28"/>
+              </w:rPr>
+              <w:t>Tên bài học</w:t>
+            </w:r>
+          </w:p>
+        </w:tc>
+        <w:tc>
+          <w:tcPr>
+            <w:tcW w:w="5193" w:type="dxa"/>
+            <w:vAlign w:val="center"/>
+          </w:tcPr>
+          <w:p>
+            <w:pPr>
+              <w:rPr>
+                <w:rFonts w:asciiTheme="majorHAnsi" w:hAnsiTheme="majorHAnsi" w:cstheme="majorHAnsi"/>
+                <w:sz w:val="28"/>
+                <w:szCs w:val="28"/>
+              </w:rPr>
+            </w:pPr>
+            <w:r>
+              <w:rPr>
+                <w:rFonts w:asciiTheme="majorHAnsi" w:hAnsiTheme="majorHAnsi" w:cstheme="majorHAnsi"/>
+                <w:sz w:val="28"/>
+                <w:szCs w:val="28"/>
+              </w:rPr>
+              <w:t>Giới thiệu về Java</w:t>
+            </w:r>
+          </w:p>
+        </w:tc>
+      </w:tr>
+      <w:tr>
+        <w:trPr>
+          <w:trHeight w:val="568"/>
+        </w:trPr>
+        <w:tc>
+          <w:tcPr>
+            <w:tcW w:w="1413" w:type="dxa"/>
+            <w:vMerge/>
+            <w:vAlign w:val="center"/>
+          </w:tcPr>
+          <w:p>
+            <w:pPr>
+              <w:jc w:val="center"/>
+              <w:rPr>
+                <w:rFonts w:asciiTheme="majorHAnsi" w:hAnsiTheme="majorHAnsi" w:cstheme="majorHAnsi"/>
+                <w:b/>
+                <w:bCs/>
+                <w:sz w:val="28"/>
+                <w:szCs w:val="28"/>
+              </w:rPr>
+            </w:pPr>
+          </w:p>
+        </w:tc>
+        <w:tc>
+          <w:tcPr>
+            <w:tcW w:w="2410" w:type="dxa"/>
+            <w:vAlign w:val="center"/>
+          </w:tcPr>
+          <w:p>
+            <w:pPr>
+              <w:rPr>
+                <w:rFonts w:asciiTheme="majorHAnsi" w:hAnsiTheme="majorHAnsi" w:cstheme="majorHAnsi"/>
+                <w:sz w:val="28"/>
+                <w:szCs w:val="28"/>
+              </w:rPr>
+            </w:pPr>
+            <w:r>
+              <w:rPr>
+                <w:rFonts w:asciiTheme="majorHAnsi" w:hAnsiTheme="majorHAnsi" w:cstheme="majorHAnsi"/>
+                <w:sz w:val="28"/>
+                <w:szCs w:val="28"/>
+              </w:rPr>
+              <w:t>Video bài giảng</w:t>
+            </w:r>
+          </w:p>
+        </w:tc>
+        <w:tc>
+          <w:tcPr>
+            <w:tcW w:w="5193" w:type="dxa"/>
+            <w:vAlign w:val="center"/>
+          </w:tcPr>
+          <w:p>
+            <w:pPr>
+              <w:rPr>
+                <w:rFonts w:asciiTheme="majorHAnsi" w:hAnsiTheme="majorHAnsi" w:cstheme="majorHAnsi"/>
+                <w:sz w:val="20"/>
+                <w:szCs w:val="20"/>
+              </w:rPr>
+            </w:pPr>
+            <w:hyperlink r:id="rId8" w:history="1">
+              <w:r>
+                <w:rPr>
+                  <w:rStyle w:val="Hyperlink"/>
+                  <w:rFonts w:asciiTheme="majorHAnsi" w:hAnsiTheme="majorHAnsi" w:cstheme="majorHAnsi"/>
+                  <w:sz w:val="20"/>
+                  <w:szCs w:val="20"/>
+                </w:rPr>
+                <w:t>https://www.youtube.</w:t>
+              </w:r>
+              <w:r>
+                <w:rPr>
+                  <w:rStyle w:val="Hyperlink"/>
+                  <w:rFonts w:asciiTheme="majorHAnsi" w:hAnsiTheme="majorHAnsi" w:cstheme="majorHAnsi"/>
+                  <w:sz w:val="20"/>
+                  <w:szCs w:val="20"/>
+                </w:rPr>
+                <w:t>c</w:t>
+              </w:r>
+              <w:r>
+                <w:rPr>
+                  <w:rStyle w:val="Hyperlink"/>
+                  <w:rFonts w:asciiTheme="majorHAnsi" w:hAnsiTheme="majorHAnsi" w:cstheme="majorHAnsi"/>
+                  <w:sz w:val="20"/>
+                  <w:szCs w:val="20"/>
+                </w:rPr>
+                <w:t>om/watch?v=3gtOA</w:t>
+              </w:r>
+              <w:r>
+                <w:rPr>
+                  <w:rStyle w:val="Hyperlink"/>
+                  <w:rFonts w:asciiTheme="majorHAnsi" w:hAnsiTheme="majorHAnsi" w:cstheme="majorHAnsi"/>
+                  <w:sz w:val="20"/>
+                  <w:szCs w:val="20"/>
+                </w:rPr>
+                <w:t>l</w:t>
+              </w:r>
+              <w:r>
+                <w:rPr>
+                  <w:rStyle w:val="Hyperlink"/>
+                  <w:rFonts w:asciiTheme="majorHAnsi" w:hAnsiTheme="majorHAnsi" w:cstheme="majorHAnsi"/>
+                  <w:sz w:val="20"/>
+                  <w:szCs w:val="20"/>
+                </w:rPr>
+                <w:t>covoQ</w:t>
+              </w:r>
+            </w:hyperlink>
+          </w:p>
+        </w:tc>
+      </w:tr>
+      <w:tr>
+        <w:trPr>
+          <w:trHeight w:val="546"/>
+        </w:trPr>
+        <w:tc>
+          <w:tcPr>
+            <w:tcW w:w="1413" w:type="dxa"/>
+            <w:vMerge w:val="restart"/>
+            <w:vAlign w:val="center"/>
+          </w:tcPr>
+          <w:p>
+            <w:pPr>
+              <w:jc w:val="center"/>
+              <w:rPr>
+                <w:rFonts w:asciiTheme="majorHAnsi" w:hAnsiTheme="majorHAnsi" w:cstheme="majorHAnsi"/>
+                <w:b/>
+                <w:bCs/>
+                <w:sz w:val="28"/>
+                <w:szCs w:val="28"/>
+              </w:rPr>
+            </w:pPr>
+            <w:r>
+              <w:rPr>
+                <w:rFonts w:asciiTheme="majorHAnsi" w:hAnsiTheme="majorHAnsi" w:cstheme="majorHAnsi"/>
+                <w:b/>
+                <w:bCs/>
+                <w:sz w:val="28"/>
+                <w:szCs w:val="28"/>
+              </w:rPr>
+              <w:t>Bài 2</w:t>
+            </w:r>
+          </w:p>
+        </w:tc>
+        <w:tc>
+          <w:tcPr>
+            <w:tcW w:w="2410" w:type="dxa"/>
+            <w:vAlign w:val="center"/>
+          </w:tcPr>
+          <w:p>
+            <w:pPr>
+              <w:rPr>
+                <w:rFonts w:asciiTheme="majorHAnsi" w:hAnsiTheme="majorHAnsi" w:cstheme="majorHAnsi"/>
+                <w:sz w:val="28"/>
+                <w:szCs w:val="28"/>
+              </w:rPr>
+            </w:pPr>
+            <w:r>
+              <w:rPr>
+                <w:rFonts w:asciiTheme="majorHAnsi" w:hAnsiTheme="majorHAnsi" w:cstheme="majorHAnsi"/>
+                <w:sz w:val="28"/>
+                <w:szCs w:val="28"/>
+              </w:rPr>
+              <w:t>Tên bài học</w:t>
+            </w:r>
+          </w:p>
+        </w:tc>
+        <w:tc>
+          <w:tcPr>
+            <w:tcW w:w="5193" w:type="dxa"/>
+            <w:vAlign w:val="center"/>
+          </w:tcPr>
+          <w:p>
+            <w:pPr>
+              <w:rPr>
+                <w:rFonts w:asciiTheme="majorHAnsi" w:hAnsiTheme="majorHAnsi" w:cstheme="majorHAnsi"/>
+                <w:sz w:val="28"/>
+                <w:szCs w:val="28"/>
+              </w:rPr>
+            </w:pPr>
+            <w:r>
+              <w:rPr>
+                <w:rFonts w:asciiTheme="majorHAnsi" w:hAnsiTheme="majorHAnsi" w:cstheme="majorHAnsi"/>
+                <w:sz w:val="28"/>
+                <w:szCs w:val="28"/>
+              </w:rPr>
+              <w:t>Cài đặt môi trường Java</w:t>
+            </w:r>
+          </w:p>
+        </w:tc>
+      </w:tr>
+      <w:tr>
+        <w:trPr>
+          <w:trHeight w:val="554"/>
+        </w:trPr>
+        <w:tc>
+          <w:tcPr>
+            <w:tcW w:w="1413" w:type="dxa"/>
+            <w:vMerge/>
+            <w:vAlign w:val="center"/>
+          </w:tcPr>
+          <w:p>
+            <w:pPr>
+              <w:jc w:val="center"/>
+              <w:rPr>
+                <w:rFonts w:asciiTheme="majorHAnsi" w:hAnsiTheme="majorHAnsi" w:cstheme="majorHAnsi"/>
+                <w:b/>
+                <w:bCs/>
+                <w:sz w:val="28"/>
+                <w:szCs w:val="28"/>
+              </w:rPr>
+            </w:pPr>
+          </w:p>
+        </w:tc>
+        <w:tc>
+          <w:tcPr>
+            <w:tcW w:w="2410" w:type="dxa"/>
+            <w:vAlign w:val="center"/>
+          </w:tcPr>
+          <w:p>
+            <w:pPr>
+              <w:rPr>
+                <w:rFonts w:asciiTheme="majorHAnsi" w:hAnsiTheme="majorHAnsi" w:cstheme="majorHAnsi"/>
+                <w:sz w:val="28"/>
+                <w:szCs w:val="28"/>
+              </w:rPr>
+            </w:pPr>
+            <w:r>
+              <w:rPr>
+                <w:rFonts w:asciiTheme="majorHAnsi" w:hAnsiTheme="majorHAnsi" w:cstheme="majorHAnsi"/>
+                <w:sz w:val="28"/>
+                <w:szCs w:val="28"/>
+              </w:rPr>
+              <w:t>Video bài giảng</w:t>
+            </w:r>
+          </w:p>
+        </w:tc>
+        <w:tc>
+          <w:tcPr>
+            <w:tcW w:w="5193" w:type="dxa"/>
+            <w:vAlign w:val="center"/>
+          </w:tcPr>
+          <w:p>
+            <w:pPr>
+              <w:rPr>
+                <w:rFonts w:asciiTheme="majorHAnsi" w:hAnsiTheme="majorHAnsi" w:cstheme="majorHAnsi"/>
+                <w:sz w:val="20"/>
+                <w:szCs w:val="20"/>
+              </w:rPr>
+            </w:pPr>
+            <w:hyperlink r:id="rId9" w:history="1">
+              <w:r>
+                <w:rPr>
+                  <w:rStyle w:val="Hyperlink"/>
+                  <w:rFonts w:asciiTheme="majorHAnsi" w:hAnsiTheme="majorHAnsi" w:cstheme="majorHAnsi"/>
+                  <w:sz w:val="20"/>
+                  <w:szCs w:val="20"/>
+                </w:rPr>
+                <w:t>https://www.youtube.com/watch?v=KjMRn1</w:t>
+              </w:r>
+              <w:r>
+                <w:rPr>
+                  <w:rStyle w:val="Hyperlink"/>
+                  <w:rFonts w:asciiTheme="majorHAnsi" w:hAnsiTheme="majorHAnsi" w:cstheme="majorHAnsi"/>
+                  <w:sz w:val="20"/>
+                  <w:szCs w:val="20"/>
+                </w:rPr>
+                <w:t>Y</w:t>
+              </w:r>
+              <w:r>
+                <w:rPr>
+                  <w:rStyle w:val="Hyperlink"/>
+                  <w:rFonts w:asciiTheme="majorHAnsi" w:hAnsiTheme="majorHAnsi" w:cstheme="majorHAnsi"/>
+                  <w:sz w:val="20"/>
+                  <w:szCs w:val="20"/>
+                </w:rPr>
+                <w:t>QcLc&amp;t=66s</w:t>
+              </w:r>
+            </w:hyperlink>
+          </w:p>
+        </w:tc>
+      </w:tr>
+      <w:tr>
+        <w:trPr>
+          <w:trHeight w:val="2100"/>
+        </w:trPr>
+        <w:tc>
+          <w:tcPr>
+            <w:tcW w:w="1413" w:type="dxa"/>
+            <w:vMerge w:val="restart"/>
+            <w:vAlign w:val="center"/>
+          </w:tcPr>
+          <w:p>
+            <w:pPr>
+              <w:jc w:val="center"/>
+              <w:rPr>
+                <w:rFonts w:asciiTheme="majorHAnsi" w:hAnsiTheme="majorHAnsi" w:cstheme="majorHAnsi"/>
+                <w:b/>
+                <w:bCs/>
+                <w:sz w:val="28"/>
+                <w:szCs w:val="28"/>
+              </w:rPr>
+            </w:pPr>
+            <w:r>
+              <w:rPr>
+                <w:rFonts w:asciiTheme="majorHAnsi" w:hAnsiTheme="majorHAnsi" w:cstheme="majorHAnsi"/>
+                <w:b/>
+                <w:bCs/>
+                <w:sz w:val="28"/>
+                <w:szCs w:val="28"/>
+              </w:rPr>
+              <w:t>Quiz 1</w:t>
+            </w:r>
+          </w:p>
+        </w:tc>
+        <w:tc>
+          <w:tcPr>
+            <w:tcW w:w="2410" w:type="dxa"/>
+            <w:vAlign w:val="center"/>
+          </w:tcPr>
+          <w:p>
+            <w:pPr>
+              <w:rPr>
+                <w:rFonts w:asciiTheme="majorHAnsi" w:hAnsiTheme="majorHAnsi" w:cstheme="majorHAnsi"/>
+                <w:sz w:val="28"/>
+                <w:szCs w:val="28"/>
+              </w:rPr>
+            </w:pPr>
+            <w:r>
+              <w:rPr>
+                <w:rFonts w:asciiTheme="majorHAnsi" w:hAnsiTheme="majorHAnsi" w:cstheme="majorHAnsi"/>
+                <w:sz w:val="28"/>
+                <w:szCs w:val="28"/>
+              </w:rPr>
+              <w:t>Câu hỏi 1</w:t>
+            </w:r>
+          </w:p>
+        </w:tc>
+        <w:tc>
+          <w:tcPr>
+            <w:tcW w:w="5193" w:type="dxa"/>
+            <w:vAlign w:val="center"/>
+          </w:tcPr>
+          <w:p>
+            <w:pPr>
+              <w:rPr>
+                <w:rFonts w:asciiTheme="majorHAnsi" w:hAnsiTheme="majorHAnsi" w:cstheme="majorHAnsi"/>
+                <w:sz w:val="28"/>
+                <w:szCs w:val="28"/>
+              </w:rPr>
+            </w:pPr>
+            <w:r>
+              <w:rPr>
+                <w:rFonts w:asciiTheme="majorHAnsi" w:hAnsiTheme="majorHAnsi" w:cstheme="majorHAnsi"/>
+                <w:sz w:val="28"/>
+                <w:szCs w:val="28"/>
+              </w:rPr>
+              <w:t>Java là ngôn ngữ lập trình do công ty nào phát triển ban đầu?</w:t>
+            </w:r>
+          </w:p>
+          <w:p>
+            <w:pPr>
+              <w:ind w:left="360"/>
+              <w:rPr>
+                <w:rFonts w:asciiTheme="majorHAnsi" w:hAnsiTheme="majorHAnsi" w:cstheme="majorHAnsi"/>
+                <w:sz w:val="28"/>
+                <w:szCs w:val="28"/>
+              </w:rPr>
+            </w:pPr>
+            <w:r>
+              <w:rPr>
+                <w:rFonts w:asciiTheme="majorHAnsi" w:hAnsiTheme="majorHAnsi" w:cstheme="majorHAnsi"/>
+                <w:sz w:val="28"/>
+                <w:szCs w:val="28"/>
+              </w:rPr>
+              <w:t>A. Microsoft</w:t>
+            </w:r>
+          </w:p>
+          <w:p>
+            <w:pPr>
+              <w:ind w:left="360"/>
+              <w:rPr>
+                <w:rFonts w:asciiTheme="majorHAnsi" w:hAnsiTheme="majorHAnsi" w:cstheme="majorHAnsi"/>
+                <w:sz w:val="28"/>
+                <w:szCs w:val="28"/>
+              </w:rPr>
+            </w:pPr>
+            <w:r>
+              <w:rPr>
+                <w:rFonts w:asciiTheme="majorHAnsi" w:hAnsiTheme="majorHAnsi" w:cstheme="majorHAnsi"/>
+                <w:sz w:val="28"/>
+                <w:szCs w:val="28"/>
+              </w:rPr>
+              <w:t xml:space="preserve">B. Sun Microsystems </w:t>
+            </w:r>
+            <w:r>
+              <w:rPr>
+                <w:rFonts w:ascii="Segoe UI Emoji" w:hAnsi="Segoe UI Emoji" w:cs="Segoe UI Emoji"/>
+                <w:sz w:val="28"/>
+                <w:szCs w:val="28"/>
+              </w:rPr>
+              <w:t>✅</w:t>
+            </w:r>
+          </w:p>
+          <w:p>
+            <w:pPr>
+              <w:ind w:left="360"/>
+              <w:rPr>
+                <w:rFonts w:asciiTheme="majorHAnsi" w:hAnsiTheme="majorHAnsi" w:cstheme="majorHAnsi"/>
+                <w:sz w:val="28"/>
+                <w:szCs w:val="28"/>
+              </w:rPr>
+            </w:pPr>
+            <w:r>
+              <w:rPr>
+                <w:rFonts w:asciiTheme="majorHAnsi" w:hAnsiTheme="majorHAnsi" w:cstheme="majorHAnsi"/>
+                <w:sz w:val="28"/>
+                <w:szCs w:val="28"/>
+              </w:rPr>
+              <w:t>C. Oracle</w:t>
+            </w:r>
+          </w:p>
+          <w:p>
+            <w:pPr>
+              <w:ind w:left="360"/>
+              <w:rPr>
+                <w:rFonts w:asciiTheme="majorHAnsi" w:hAnsiTheme="majorHAnsi" w:cstheme="majorHAnsi"/>
+                <w:sz w:val="28"/>
+                <w:szCs w:val="28"/>
+              </w:rPr>
+            </w:pPr>
+            <w:r>
+              <w:rPr>
+                <w:rFonts w:asciiTheme="majorHAnsi" w:hAnsiTheme="majorHAnsi" w:cstheme="majorHAnsi"/>
+                <w:sz w:val="28"/>
+                <w:szCs w:val="28"/>
+              </w:rPr>
+              <w:t>D. IBM</w:t>
+            </w:r>
+          </w:p>
+        </w:tc>
+      </w:tr>
+      <w:tr>
+        <w:trPr>
+          <w:trHeight w:val="2117"/>
+        </w:trPr>
+        <w:tc>
+          <w:tcPr>
+            <w:tcW w:w="1413" w:type="dxa"/>
+            <w:vMerge/>
+            <w:vAlign w:val="center"/>
+          </w:tcPr>
+          <w:p>
+            <w:pPr>
+              <w:jc w:val="center"/>
+              <w:rPr>
+                <w:rFonts w:asciiTheme="majorHAnsi" w:hAnsiTheme="majorHAnsi" w:cstheme="majorHAnsi"/>
+                <w:sz w:val="28"/>
+                <w:szCs w:val="28"/>
+              </w:rPr>
+            </w:pPr>
+          </w:p>
+        </w:tc>
+        <w:tc>
+          <w:tcPr>
+            <w:tcW w:w="2410" w:type="dxa"/>
+            <w:vAlign w:val="center"/>
+          </w:tcPr>
+          <w:p>
+            <w:pPr>
+              <w:rPr>
+                <w:rFonts w:asciiTheme="majorHAnsi" w:hAnsiTheme="majorHAnsi" w:cstheme="majorHAnsi"/>
+                <w:sz w:val="28"/>
+                <w:szCs w:val="28"/>
+              </w:rPr>
+            </w:pPr>
+            <w:r>
+              <w:rPr>
+                <w:rFonts w:asciiTheme="majorHAnsi" w:hAnsiTheme="majorHAnsi" w:cstheme="majorHAnsi"/>
+                <w:sz w:val="28"/>
+                <w:szCs w:val="28"/>
+              </w:rPr>
+              <w:t>Câu hỏi 2:</w:t>
+            </w:r>
+          </w:p>
+        </w:tc>
+        <w:tc>
+          <w:tcPr>
+            <w:tcW w:w="5193" w:type="dxa"/>
+            <w:vAlign w:val="center"/>
+          </w:tcPr>
+          <w:p>
+            <w:pPr>
+              <w:rPr>
+                <w:rFonts w:asciiTheme="majorHAnsi" w:hAnsiTheme="majorHAnsi" w:cstheme="majorHAnsi"/>
+                <w:sz w:val="28"/>
+                <w:szCs w:val="28"/>
+              </w:rPr>
+            </w:pPr>
+            <w:r>
+              <w:rPr>
+                <w:rFonts w:asciiTheme="majorHAnsi" w:hAnsiTheme="majorHAnsi" w:cstheme="majorHAnsi"/>
+                <w:sz w:val="28"/>
+                <w:szCs w:val="28"/>
+              </w:rPr>
+              <w:t>Để lập trình Java trên máy tính cá nhân, bạn cần cài đặt phần mềm nào?</w:t>
+            </w:r>
+          </w:p>
+          <w:p>
+            <w:pPr>
+              <w:ind w:left="360"/>
+              <w:rPr>
+                <w:rFonts w:asciiTheme="majorHAnsi" w:hAnsiTheme="majorHAnsi" w:cstheme="majorHAnsi"/>
+                <w:sz w:val="28"/>
+                <w:szCs w:val="28"/>
+              </w:rPr>
+            </w:pPr>
+            <w:r>
+              <w:rPr>
+                <w:rFonts w:asciiTheme="majorHAnsi" w:hAnsiTheme="majorHAnsi" w:cstheme="majorHAnsi"/>
+                <w:sz w:val="28"/>
+                <w:szCs w:val="28"/>
+              </w:rPr>
+              <w:t xml:space="preserve">A. JDK (Java Development Kit) </w:t>
+            </w:r>
+            <w:r>
+              <w:rPr>
+                <w:rFonts w:ascii="Segoe UI Emoji" w:hAnsi="Segoe UI Emoji" w:cs="Segoe UI Emoji"/>
+                <w:sz w:val="28"/>
+                <w:szCs w:val="28"/>
+              </w:rPr>
+              <w:t>✅</w:t>
+            </w:r>
+          </w:p>
+          <w:p>
+            <w:pPr>
+              <w:ind w:left="360"/>
+              <w:rPr>
+                <w:rFonts w:asciiTheme="majorHAnsi" w:hAnsiTheme="majorHAnsi" w:cstheme="majorHAnsi"/>
+                <w:sz w:val="28"/>
+                <w:szCs w:val="28"/>
+              </w:rPr>
+            </w:pPr>
+            <w:r>
+              <w:rPr>
+                <w:rFonts w:asciiTheme="majorHAnsi" w:hAnsiTheme="majorHAnsi" w:cstheme="majorHAnsi"/>
+                <w:sz w:val="28"/>
+                <w:szCs w:val="28"/>
+              </w:rPr>
+              <w:t>B. Microsoft .NET Framework</w:t>
+            </w:r>
+          </w:p>
+          <w:p>
+            <w:pPr>
+              <w:ind w:left="360"/>
+              <w:rPr>
+                <w:rFonts w:asciiTheme="majorHAnsi" w:hAnsiTheme="majorHAnsi" w:cstheme="majorHAnsi"/>
+                <w:sz w:val="28"/>
+                <w:szCs w:val="28"/>
+              </w:rPr>
+            </w:pPr>
+            <w:r>
+              <w:rPr>
+                <w:rFonts w:asciiTheme="majorHAnsi" w:hAnsiTheme="majorHAnsi" w:cstheme="majorHAnsi"/>
+                <w:sz w:val="28"/>
+                <w:szCs w:val="28"/>
+              </w:rPr>
+              <w:t>C. Python Interpreter</w:t>
+            </w:r>
+          </w:p>
+          <w:p>
+            <w:pPr>
+              <w:ind w:left="360"/>
+              <w:rPr>
+                <w:rFonts w:asciiTheme="majorHAnsi" w:hAnsiTheme="majorHAnsi" w:cstheme="majorHAnsi"/>
+                <w:sz w:val="28"/>
+                <w:szCs w:val="28"/>
+              </w:rPr>
+            </w:pPr>
+            <w:r>
+              <w:rPr>
+                <w:rFonts w:asciiTheme="majorHAnsi" w:hAnsiTheme="majorHAnsi" w:cstheme="majorHAnsi"/>
+                <w:sz w:val="28"/>
+                <w:szCs w:val="28"/>
+              </w:rPr>
+              <w:t>D. Node.js</w:t>
+            </w:r>
+          </w:p>
+        </w:tc>
+      </w:tr>
+    </w:tbl>
+    <w:p>
+      <w:pPr>
+        <w:rPr>
+          <w:rFonts w:asciiTheme="majorHAnsi" w:hAnsiTheme="majorHAnsi" w:cstheme="majorHAnsi"/>
+          <w:sz w:val="28"/>
+          <w:szCs w:val="28"/>
+        </w:rPr>
+      </w:pPr>
+    </w:p>
+    <w:p>
+      <w:pPr>
+        <w:pStyle w:val="ListParagraph"/>
+        <w:numPr>
+          <w:ilvl w:val="1"/>
+          <w:numId w:val="2"/>
+        </w:numPr>
+        <w:rPr>
+          <w:rFonts w:asciiTheme="majorHAnsi" w:hAnsiTheme="majorHAnsi" w:cstheme="majorHAnsi"/>
+          <w:sz w:val="28"/>
+          <w:szCs w:val="28"/>
+        </w:rPr>
+      </w:pPr>
+      <w:r>
+        <w:rPr>
+          <w:rFonts w:asciiTheme="majorHAnsi" w:hAnsiTheme="majorHAnsi" w:cstheme="majorHAnsi"/>
+          <w:sz w:val="28"/>
+          <w:szCs w:val="28"/>
+        </w:rPr>
+        <w:t>Bước 7: Nhấn lưu bản nháp</w:t>
+      </w:r>
+      <w:r>
+        <w:rPr>
+          <w:rFonts w:asciiTheme="majorHAnsi" w:hAnsiTheme="majorHAnsi" w:cstheme="majorHAnsi"/>
+          <w:sz w:val="28"/>
+          <w:szCs w:val="28"/>
+        </w:rPr>
+        <w:br/>
+        <w:t>(</w:t>
+      </w:r>
+      <w:r>
+        <w:rPr>
+          <w:rFonts w:asciiTheme="majorHAnsi" w:hAnsiTheme="majorHAnsi" w:cstheme="majorHAnsi"/>
+          <w:sz w:val="28"/>
+          <w:szCs w:val="28"/>
+        </w:rPr>
+        <w:t xml:space="preserve">khóa học </w:t>
+      </w:r>
+      <w:r>
+        <w:rPr>
+          <w:rFonts w:asciiTheme="majorHAnsi" w:hAnsiTheme="majorHAnsi" w:cstheme="majorHAnsi"/>
+          <w:sz w:val="28"/>
+          <w:szCs w:val="28"/>
+        </w:rPr>
+        <w:t xml:space="preserve">được tạo với </w:t>
+      </w:r>
+      <w:r>
+        <w:rPr>
+          <w:rFonts w:asciiTheme="majorHAnsi" w:hAnsiTheme="majorHAnsi" w:cstheme="majorHAnsi"/>
+          <w:sz w:val="28"/>
+          <w:szCs w:val="28"/>
+        </w:rPr>
+        <w:t xml:space="preserve">trạng thái mặc định là </w:t>
+      </w:r>
+      <w:r>
+        <w:rPr>
+          <w:rFonts w:asciiTheme="majorHAnsi" w:hAnsiTheme="majorHAnsi" w:cstheme="majorHAnsi"/>
+          <w:sz w:val="28"/>
+          <w:szCs w:val="28"/>
+        </w:rPr>
+        <w:t xml:space="preserve">draft, </w:t>
+      </w:r>
+      <w:r>
+        <w:rPr>
+          <w:rFonts w:asciiTheme="majorHAnsi" w:hAnsiTheme="majorHAnsi" w:cstheme="majorHAnsi"/>
+          <w:sz w:val="28"/>
+          <w:szCs w:val="28"/>
+        </w:rPr>
+        <w:t>Admin và Instructor có thể preview khóa học</w:t>
+      </w:r>
+      <w:r>
+        <w:rPr>
+          <w:rFonts w:asciiTheme="majorHAnsi" w:hAnsiTheme="majorHAnsi" w:cstheme="majorHAnsi"/>
+          <w:sz w:val="28"/>
+          <w:szCs w:val="28"/>
+        </w:rPr>
+        <w:t>)</w:t>
       </w:r>
     </w:p>
     <w:p>
@@ -227,17 +2657,21 @@
         </w:numPr>
         <w:rPr>
           <w:rFonts w:asciiTheme="majorHAnsi" w:hAnsiTheme="majorHAnsi" w:cstheme="majorHAnsi"/>
-          <w:sz w:val="28"/>
-          <w:szCs w:val="28"/>
-        </w:rPr>
-      </w:pPr>
-      <w:r>
-        <w:rPr>
-          <w:rFonts w:asciiTheme="majorHAnsi" w:hAnsiTheme="majorHAnsi" w:cstheme="majorHAnsi"/>
-          <w:sz w:val="28"/>
-          <w:szCs w:val="28"/>
-        </w:rPr>
-        <w:t>Admin phê duyệt khóa học</w:t>
+          <w:b/>
+          <w:bCs/>
+          <w:sz w:val="28"/>
+          <w:szCs w:val="28"/>
+        </w:rPr>
+      </w:pPr>
+      <w:r>
+        <w:rPr>
+          <w:rFonts w:asciiTheme="majorHAnsi" w:hAnsiTheme="majorHAnsi" w:cstheme="majorHAnsi"/>
+          <w:b/>
+          <w:bCs/>
+          <w:sz w:val="28"/>
+          <w:szCs w:val="28"/>
+        </w:rPr>
+        <w:t>Instructor yêu cầu phê duyệt khóa học</w:t>
       </w:r>
     </w:p>
     <w:p>
@@ -259,7 +2693,64 @@
           <w:sz w:val="28"/>
           <w:szCs w:val="28"/>
         </w:rPr>
-        <w:t>Đăng nhập tài khoản Admin và truy cập trang admin</w:t>
+        <w:t xml:space="preserve">Bước </w:t>
+      </w:r>
+      <w:r>
+        <w:rPr>
+          <w:rFonts w:asciiTheme="majorHAnsi" w:hAnsiTheme="majorHAnsi" w:cstheme="majorHAnsi"/>
+          <w:sz w:val="28"/>
+          <w:szCs w:val="28"/>
+        </w:rPr>
+        <w:t>1</w:t>
+      </w:r>
+      <w:r>
+        <w:rPr>
+          <w:rFonts w:asciiTheme="majorHAnsi" w:hAnsiTheme="majorHAnsi" w:cstheme="majorHAnsi"/>
+          <w:sz w:val="28"/>
+          <w:szCs w:val="28"/>
+        </w:rPr>
+        <w:t xml:space="preserve">: Chọn khóa học vừa tạo </w:t>
+      </w:r>
+      <w:r>
+        <w:rPr>
+          <w:rFonts w:asciiTheme="majorHAnsi" w:hAnsiTheme="majorHAnsi" w:cstheme="majorHAnsi"/>
+          <w:sz w:val="28"/>
+          <w:szCs w:val="28"/>
+        </w:rPr>
+        <w:t>→</w:t>
+      </w:r>
+      <w:r>
+        <w:rPr>
+          <w:rFonts w:asciiTheme="majorHAnsi" w:hAnsiTheme="majorHAnsi" w:cstheme="majorHAnsi"/>
+          <w:sz w:val="28"/>
+          <w:szCs w:val="28"/>
+        </w:rPr>
+        <w:t xml:space="preserve"> edit </w:t>
+      </w:r>
+      <w:r>
+        <w:rPr>
+          <w:rFonts w:asciiTheme="majorHAnsi" w:hAnsiTheme="majorHAnsi" w:cstheme="majorHAnsi"/>
+          <w:sz w:val="28"/>
+          <w:szCs w:val="28"/>
+        </w:rPr>
+        <w:t>→</w:t>
+      </w:r>
+      <w:r>
+        <w:rPr>
+          <w:rFonts w:asciiTheme="majorHAnsi" w:hAnsiTheme="majorHAnsi" w:cstheme="majorHAnsi"/>
+          <w:sz w:val="28"/>
+          <w:szCs w:val="28"/>
+        </w:rPr>
+        <w:t xml:space="preserve"> yêu cầu phê duyệt</w:t>
+      </w:r>
+      <w:r>
+        <w:rPr>
+          <w:rFonts w:asciiTheme="majorHAnsi" w:hAnsiTheme="majorHAnsi" w:cstheme="majorHAnsi"/>
+          <w:sz w:val="28"/>
+          <w:szCs w:val="28"/>
+        </w:rPr>
+        <w:br/>
+        <w:t>để gửi yêu cầu phê duyệt đến admin</w:t>
       </w:r>
     </w:p>
     <w:p>
@@ -281,7 +2772,7 @@
           <w:sz w:val="28"/>
           <w:szCs w:val="28"/>
         </w:rPr>
-        <w:t>Xem chi tiết các khóa học đang yêu cầu phê duyệt</w:t>
+        <w:t>Bước 2: Yêu cầu phê duyệt được gửi đến Admin</w:t>
       </w:r>
       <w:r>
         <w:rPr>
@@ -290,7 +2781,49 @@
           <w:szCs w:val="28"/>
         </w:rPr>
         <w:br/>
-        <w:t>(Admin và Instructor có thể preview khóa học)</w:t>
+        <w:t xml:space="preserve">(Khóa học sẽ chuyển từ trạng thái draft </w:t>
+      </w:r>
+      <w:r>
+        <w:rPr>
+          <w:rFonts w:asciiTheme="majorHAnsi" w:hAnsiTheme="majorHAnsi" w:cstheme="majorHAnsi"/>
+          <w:sz w:val="28"/>
+          <w:szCs w:val="28"/>
+        </w:rPr>
+        <w:t>→</w:t>
+      </w:r>
+      <w:r>
+        <w:rPr>
+          <w:rFonts w:asciiTheme="majorHAnsi" w:hAnsiTheme="majorHAnsi" w:cstheme="majorHAnsi"/>
+          <w:sz w:val="28"/>
+          <w:szCs w:val="28"/>
+        </w:rPr>
+        <w:t xml:space="preserve"> pending)</w:t>
+      </w:r>
+    </w:p>
+    <w:p>
+      <w:pPr>
+        <w:pStyle w:val="ListParagraph"/>
+        <w:numPr>
+          <w:ilvl w:val="0"/>
+          <w:numId w:val="2"/>
+        </w:numPr>
+        <w:rPr>
+          <w:rFonts w:asciiTheme="majorHAnsi" w:hAnsiTheme="majorHAnsi" w:cstheme="majorHAnsi"/>
+          <w:b/>
+          <w:bCs/>
+          <w:sz w:val="28"/>
+          <w:szCs w:val="28"/>
+        </w:rPr>
+      </w:pPr>
+      <w:r>
+        <w:rPr>
+          <w:rFonts w:asciiTheme="majorHAnsi" w:hAnsiTheme="majorHAnsi" w:cstheme="majorHAnsi"/>
+          <w:b/>
+          <w:bCs/>
+          <w:sz w:val="28"/>
+          <w:szCs w:val="28"/>
+        </w:rPr>
+        <w:t>Admin phê duyệt khóa học</w:t>
       </w:r>
     </w:p>
     <w:p>
@@ -312,7 +2845,350 @@
           <w:sz w:val="28"/>
           <w:szCs w:val="28"/>
         </w:rPr>
+        <w:t xml:space="preserve">Bước 1: Truy cập trang admin ( </w:t>
+      </w:r>
+      <w:hyperlink r:id="rId10" w:history="1">
+        <w:r>
+          <w:rPr>
+            <w:rStyle w:val="Hyperlink"/>
+            <w:rFonts w:asciiTheme="majorHAnsi" w:hAnsiTheme="majorHAnsi" w:cstheme="majorHAnsi"/>
+            <w:sz w:val="28"/>
+            <w:szCs w:val="28"/>
+          </w:rPr>
+          <w:t>http://localhost:8080/admin</w:t>
+        </w:r>
+      </w:hyperlink>
+      <w:r>
+        <w:rPr>
+          <w:rFonts w:asciiTheme="majorHAnsi" w:hAnsiTheme="majorHAnsi" w:cstheme="majorHAnsi"/>
+          <w:sz w:val="28"/>
+          <w:szCs w:val="28"/>
+        </w:rPr>
+        <w:t xml:space="preserve"> )</w:t>
+      </w:r>
+    </w:p>
+    <w:p>
+      <w:pPr>
+        <w:pStyle w:val="ListParagraph"/>
+        <w:numPr>
+          <w:ilvl w:val="1"/>
+          <w:numId w:val="2"/>
+        </w:numPr>
+        <w:rPr>
+          <w:rFonts w:asciiTheme="majorHAnsi" w:hAnsiTheme="majorHAnsi" w:cstheme="majorHAnsi"/>
+          <w:sz w:val="28"/>
+          <w:szCs w:val="28"/>
+        </w:rPr>
+      </w:pPr>
+      <w:r>
+        <w:rPr>
+          <w:rFonts w:asciiTheme="majorHAnsi" w:hAnsiTheme="majorHAnsi" w:cstheme="majorHAnsi"/>
+          <w:sz w:val="28"/>
+          <w:szCs w:val="28"/>
+        </w:rPr>
+        <w:t>Bước 2: Đăng nhập tài khoản Admin</w:t>
+      </w:r>
+      <w:r>
+        <w:rPr>
+          <w:rFonts w:asciiTheme="majorHAnsi" w:hAnsiTheme="majorHAnsi" w:cstheme="majorHAnsi"/>
+          <w:sz w:val="28"/>
+          <w:szCs w:val="28"/>
+        </w:rPr>
+        <w:br/>
+        <w:t>(</w:t>
+      </w:r>
+      <w:r>
+        <w:rPr>
+          <w:rFonts w:asciiTheme="majorHAnsi" w:hAnsiTheme="majorHAnsi" w:cstheme="majorHAnsi"/>
+          <w:sz w:val="28"/>
+          <w:szCs w:val="28"/>
+        </w:rPr>
+        <w:t>admin@viettutor.com</w:t>
+      </w:r>
+      <w:r>
+        <w:rPr>
+          <w:rFonts w:asciiTheme="majorHAnsi" w:hAnsiTheme="majorHAnsi" w:cstheme="majorHAnsi"/>
+          <w:sz w:val="28"/>
+          <w:szCs w:val="28"/>
+        </w:rPr>
+        <w:t xml:space="preserve"> | 123456)</w:t>
+      </w:r>
+    </w:p>
+    <w:p>
+      <w:pPr>
+        <w:pStyle w:val="ListParagraph"/>
+        <w:numPr>
+          <w:ilvl w:val="1"/>
+          <w:numId w:val="2"/>
+        </w:numPr>
+        <w:rPr>
+          <w:rFonts w:asciiTheme="majorHAnsi" w:hAnsiTheme="majorHAnsi" w:cstheme="majorHAnsi"/>
+          <w:sz w:val="28"/>
+          <w:szCs w:val="28"/>
+        </w:rPr>
+      </w:pPr>
+      <w:r>
+        <w:rPr>
+          <w:rFonts w:asciiTheme="majorHAnsi" w:hAnsiTheme="majorHAnsi" w:cstheme="majorHAnsi"/>
+          <w:sz w:val="28"/>
+          <w:szCs w:val="28"/>
+        </w:rPr>
+        <w:t>Bước 3: Chọn</w:t>
+      </w:r>
+      <w:r>
+        <w:rPr>
+          <w:rFonts w:asciiTheme="majorHAnsi" w:hAnsiTheme="majorHAnsi" w:cstheme="majorHAnsi"/>
+          <w:sz w:val="28"/>
+          <w:szCs w:val="28"/>
+        </w:rPr>
+        <w:t xml:space="preserve"> Khóa học</w:t>
+      </w:r>
+      <w:r>
+        <w:rPr>
+          <w:rFonts w:asciiTheme="majorHAnsi" w:hAnsiTheme="majorHAnsi" w:cstheme="majorHAnsi"/>
+          <w:sz w:val="28"/>
+          <w:szCs w:val="28"/>
+        </w:rPr>
+        <w:t xml:space="preserve"> </w:t>
+      </w:r>
+      <w:r>
+        <w:rPr>
+          <w:rFonts w:asciiTheme="majorHAnsi" w:hAnsiTheme="majorHAnsi" w:cstheme="majorHAnsi"/>
+          <w:sz w:val="28"/>
+          <w:szCs w:val="28"/>
+        </w:rPr>
+        <w:t>→</w:t>
+      </w:r>
+      <w:r>
+        <w:rPr>
+          <w:rFonts w:asciiTheme="majorHAnsi" w:hAnsiTheme="majorHAnsi" w:cstheme="majorHAnsi"/>
+          <w:sz w:val="28"/>
+          <w:szCs w:val="28"/>
+        </w:rPr>
+        <w:t xml:space="preserve"> </w:t>
+      </w:r>
+      <w:r>
+        <w:rPr>
+          <w:rFonts w:asciiTheme="majorHAnsi" w:hAnsiTheme="majorHAnsi" w:cstheme="majorHAnsi"/>
+          <w:sz w:val="28"/>
+          <w:szCs w:val="28"/>
+        </w:rPr>
+        <w:t xml:space="preserve">Phê duyệt khóa </w:t>
+      </w:r>
+      <w:r>
+        <w:rPr>
+          <w:rFonts w:asciiTheme="majorHAnsi" w:hAnsiTheme="majorHAnsi" w:cstheme="majorHAnsi"/>
+          <w:sz w:val="28"/>
+          <w:szCs w:val="28"/>
+        </w:rPr>
+        <w:t>học</w:t>
+      </w:r>
+      <w:r>
+        <w:rPr>
+          <w:rFonts w:asciiTheme="majorHAnsi" w:hAnsiTheme="majorHAnsi" w:cstheme="majorHAnsi"/>
+          <w:sz w:val="28"/>
+          <w:szCs w:val="28"/>
+        </w:rPr>
+        <w:t xml:space="preserve"> </w:t>
+      </w:r>
+    </w:p>
+    <w:p>
+      <w:pPr>
+        <w:pStyle w:val="ListParagraph"/>
+        <w:numPr>
+          <w:ilvl w:val="1"/>
+          <w:numId w:val="2"/>
+        </w:numPr>
+        <w:rPr>
+          <w:rFonts w:asciiTheme="majorHAnsi" w:hAnsiTheme="majorHAnsi" w:cstheme="majorHAnsi"/>
+          <w:sz w:val="28"/>
+          <w:szCs w:val="28"/>
+        </w:rPr>
+      </w:pPr>
+      <w:r>
+        <w:rPr>
+          <w:rFonts w:asciiTheme="majorHAnsi" w:hAnsiTheme="majorHAnsi" w:cstheme="majorHAnsi"/>
+          <w:sz w:val="28"/>
+          <w:szCs w:val="28"/>
+        </w:rPr>
+        <w:t xml:space="preserve">Bước 4: </w:t>
+      </w:r>
+      <w:r>
+        <w:rPr>
+          <w:rFonts w:asciiTheme="majorHAnsi" w:hAnsiTheme="majorHAnsi" w:cstheme="majorHAnsi"/>
+          <w:sz w:val="28"/>
+          <w:szCs w:val="28"/>
+        </w:rPr>
+        <w:t xml:space="preserve">Chọn khóa học cần phê </w:t>
+      </w:r>
+      <w:r>
+        <w:rPr>
+          <w:rFonts w:asciiTheme="majorHAnsi" w:hAnsiTheme="majorHAnsi" w:cstheme="majorHAnsi"/>
+          <w:sz w:val="28"/>
+          <w:szCs w:val="28"/>
+        </w:rPr>
+        <w:t>duyệt và xem khóa học</w:t>
+      </w:r>
+      <w:r>
+        <w:rPr>
+          <w:rFonts w:asciiTheme="majorHAnsi" w:hAnsiTheme="majorHAnsi" w:cstheme="majorHAnsi"/>
+          <w:sz w:val="28"/>
+          <w:szCs w:val="28"/>
+        </w:rPr>
+        <w:br/>
+        <w:t>(Admin và Instructor có thể preview khóa học)</w:t>
+      </w:r>
+    </w:p>
+    <w:p>
+      <w:pPr>
+        <w:pStyle w:val="ListParagraph"/>
+        <w:numPr>
+          <w:ilvl w:val="1"/>
+          <w:numId w:val="2"/>
+        </w:numPr>
+        <w:rPr>
+          <w:rFonts w:asciiTheme="majorHAnsi" w:hAnsiTheme="majorHAnsi" w:cstheme="majorHAnsi"/>
+          <w:sz w:val="28"/>
+          <w:szCs w:val="28"/>
+        </w:rPr>
+      </w:pPr>
+      <w:r>
+        <w:rPr>
+          <w:rFonts w:asciiTheme="majorHAnsi" w:hAnsiTheme="majorHAnsi" w:cstheme="majorHAnsi"/>
+          <w:sz w:val="28"/>
+          <w:szCs w:val="28"/>
+        </w:rPr>
+        <w:t xml:space="preserve">Bước 4: </w:t>
+      </w:r>
+      <w:r>
+        <w:rPr>
+          <w:rFonts w:asciiTheme="majorHAnsi" w:hAnsiTheme="majorHAnsi" w:cstheme="majorHAnsi"/>
+          <w:sz w:val="28"/>
+          <w:szCs w:val="28"/>
+        </w:rPr>
         <w:t>Chấp nhận hoặc từ chối yêu cầu phê duyệt</w:t>
+      </w:r>
+    </w:p>
+    <w:p>
+      <w:pPr>
+        <w:pStyle w:val="ListParagraph"/>
+        <w:numPr>
+          <w:ilvl w:val="2"/>
+          <w:numId w:val="2"/>
+        </w:numPr>
+        <w:rPr>
+          <w:rFonts w:asciiTheme="majorHAnsi" w:hAnsiTheme="majorHAnsi" w:cstheme="majorHAnsi"/>
+          <w:sz w:val="28"/>
+          <w:szCs w:val="28"/>
+        </w:rPr>
+      </w:pPr>
+      <w:r>
+        <w:rPr>
+          <w:rFonts w:asciiTheme="majorHAnsi" w:hAnsiTheme="majorHAnsi" w:cstheme="majorHAnsi"/>
+          <w:sz w:val="28"/>
+          <w:szCs w:val="28"/>
+        </w:rPr>
+        <w:t>Nếu từ chối yêu cầu phê duyệt,</w:t>
+      </w:r>
+      <w:r>
+        <w:rPr>
+          <w:rFonts w:asciiTheme="majorHAnsi" w:hAnsiTheme="majorHAnsi" w:cstheme="majorHAnsi"/>
+          <w:sz w:val="28"/>
+          <w:szCs w:val="28"/>
+        </w:rPr>
+        <w:t xml:space="preserve"> </w:t>
+      </w:r>
+      <w:r>
+        <w:rPr>
+          <w:rFonts w:asciiTheme="majorHAnsi" w:hAnsiTheme="majorHAnsi" w:cstheme="majorHAnsi"/>
+          <w:sz w:val="28"/>
+          <w:szCs w:val="28"/>
+        </w:rPr>
+        <w:t>trạng thái</w:t>
+      </w:r>
+      <w:r>
+        <w:rPr>
+          <w:rFonts w:asciiTheme="majorHAnsi" w:hAnsiTheme="majorHAnsi" w:cstheme="majorHAnsi"/>
+          <w:sz w:val="28"/>
+          <w:szCs w:val="28"/>
+        </w:rPr>
+        <w:t xml:space="preserve"> khóa học sẽ từ pending </w:t>
+      </w:r>
+      <w:r>
+        <w:rPr>
+          <w:rFonts w:asciiTheme="majorHAnsi" w:hAnsiTheme="majorHAnsi" w:cstheme="majorHAnsi"/>
+          <w:sz w:val="28"/>
+          <w:szCs w:val="28"/>
+        </w:rPr>
+        <w:t>→</w:t>
+      </w:r>
+      <w:r>
+        <w:rPr>
+          <w:rFonts w:asciiTheme="majorHAnsi" w:hAnsiTheme="majorHAnsi" w:cstheme="majorHAnsi"/>
+          <w:sz w:val="28"/>
+          <w:szCs w:val="28"/>
+        </w:rPr>
+        <w:t xml:space="preserve"> draft</w:t>
+      </w:r>
+    </w:p>
+    <w:p>
+      <w:pPr>
+        <w:pStyle w:val="ListParagraph"/>
+        <w:numPr>
+          <w:ilvl w:val="2"/>
+          <w:numId w:val="2"/>
+        </w:numPr>
+        <w:rPr>
+          <w:rFonts w:asciiTheme="majorHAnsi" w:hAnsiTheme="majorHAnsi" w:cstheme="majorHAnsi"/>
+          <w:sz w:val="28"/>
+          <w:szCs w:val="28"/>
+        </w:rPr>
+      </w:pPr>
+      <w:r>
+        <w:rPr>
+          <w:rFonts w:asciiTheme="majorHAnsi" w:hAnsiTheme="majorHAnsi" w:cstheme="majorHAnsi"/>
+          <w:sz w:val="28"/>
+          <w:szCs w:val="28"/>
+        </w:rPr>
+        <w:t xml:space="preserve">Nếu chấp nhận yêu cầu phê duyệt, trạng thái khóa học sẽ từ pending </w:t>
+      </w:r>
+      <w:r>
+        <w:rPr>
+          <w:rFonts w:asciiTheme="majorHAnsi" w:hAnsiTheme="majorHAnsi" w:cstheme="majorHAnsi"/>
+          <w:sz w:val="28"/>
+          <w:szCs w:val="28"/>
+        </w:rPr>
+        <w:t>→</w:t>
+      </w:r>
+      <w:r>
+        <w:rPr>
+          <w:rFonts w:asciiTheme="majorHAnsi" w:hAnsiTheme="majorHAnsi" w:cstheme="majorHAnsi"/>
+          <w:sz w:val="28"/>
+          <w:szCs w:val="28"/>
+        </w:rPr>
+        <w:t xml:space="preserve"> publish</w:t>
+      </w:r>
+    </w:p>
+    <w:p>
+      <w:pPr>
+        <w:pStyle w:val="ListParagraph"/>
+        <w:numPr>
+          <w:ilvl w:val="2"/>
+          <w:numId w:val="2"/>
+        </w:numPr>
+        <w:rPr>
+          <w:rFonts w:asciiTheme="majorHAnsi" w:hAnsiTheme="majorHAnsi" w:cstheme="majorHAnsi"/>
+          <w:sz w:val="28"/>
+          <w:szCs w:val="28"/>
+        </w:rPr>
+      </w:pPr>
+      <w:r>
+        <w:rPr>
+          <w:rFonts w:asciiTheme="majorHAnsi" w:hAnsiTheme="majorHAnsi" w:cstheme="majorHAnsi"/>
+          <w:sz w:val="28"/>
+          <w:szCs w:val="28"/>
+        </w:rPr>
+        <w:t>Khóa học đã được phê duyệt và công khai (publish) sẽ không thể chỉnh sửa và xóa khóa học, chỉ có thể ẩn khóa học (hidden)</w:t>
       </w:r>
     </w:p>
     <w:p>
@@ -324,13 +3200,17 @@
         </w:numPr>
         <w:rPr>
           <w:rFonts w:asciiTheme="majorHAnsi" w:hAnsiTheme="majorHAnsi" w:cstheme="majorHAnsi"/>
-          <w:sz w:val="28"/>
-          <w:szCs w:val="28"/>
-        </w:rPr>
-      </w:pPr>
-      <w:r>
-        <w:rPr>
-          <w:rFonts w:asciiTheme="majorHAnsi" w:hAnsiTheme="majorHAnsi" w:cstheme="majorHAnsi"/>
+          <w:b/>
+          <w:bCs/>
+          <w:sz w:val="28"/>
+          <w:szCs w:val="28"/>
+        </w:rPr>
+      </w:pPr>
+      <w:r>
+        <w:rPr>
+          <w:rFonts w:asciiTheme="majorHAnsi" w:hAnsiTheme="majorHAnsi" w:cstheme="majorHAnsi"/>
+          <w:b/>
+          <w:bCs/>
           <w:sz w:val="28"/>
           <w:szCs w:val="28"/>
         </w:rPr>
@@ -356,7 +3236,26 @@
           <w:sz w:val="28"/>
           <w:szCs w:val="28"/>
         </w:rPr>
-        <w:t>Đăng nhập tài khoản Admin và truy cập trang admin</w:t>
+        <w:t xml:space="preserve">Bước 1: Truy cập trang admin ( </w:t>
+      </w:r>
+      <w:hyperlink r:id="rId11" w:history="1">
+        <w:r>
+          <w:rPr>
+            <w:rStyle w:val="Hyperlink"/>
+            <w:rFonts w:asciiTheme="majorHAnsi" w:hAnsiTheme="majorHAnsi" w:cstheme="majorHAnsi"/>
+            <w:sz w:val="28"/>
+            <w:szCs w:val="28"/>
+          </w:rPr>
+          <w:t>http://localhost:8080/admin</w:t>
+        </w:r>
+      </w:hyperlink>
+      <w:r>
+        <w:rPr>
+          <w:rFonts w:asciiTheme="majorHAnsi" w:hAnsiTheme="majorHAnsi" w:cstheme="majorHAnsi"/>
+          <w:sz w:val="28"/>
+          <w:szCs w:val="28"/>
+        </w:rPr>
+        <w:t xml:space="preserve"> )</w:t>
       </w:r>
     </w:p>
     <w:p>
@@ -378,7 +3277,32 @@
           <w:sz w:val="28"/>
           <w:szCs w:val="28"/>
         </w:rPr>
-        <w:t>Xem danh sách các khóa học đã được phê duyệt và công khai</w:t>
+        <w:t>Bước 2: Đăng nhập tài khoản Admin</w:t>
+      </w:r>
+      <w:r>
+        <w:rPr>
+          <w:rFonts w:asciiTheme="majorHAnsi" w:hAnsiTheme="majorHAnsi" w:cstheme="majorHAnsi"/>
+          <w:sz w:val="28"/>
+          <w:szCs w:val="28"/>
+        </w:rPr>
+        <w:br/>
+        <w:t>(</w:t>
+      </w:r>
+      <w:r>
+        <w:rPr>
+          <w:rFonts w:asciiTheme="majorHAnsi" w:hAnsiTheme="majorHAnsi" w:cstheme="majorHAnsi"/>
+          <w:sz w:val="28"/>
+          <w:szCs w:val="28"/>
+        </w:rPr>
+        <w:t>admin@viettutor.com</w:t>
+      </w:r>
+      <w:r>
+        <w:rPr>
+          <w:rFonts w:asciiTheme="majorHAnsi" w:hAnsiTheme="majorHAnsi" w:cstheme="majorHAnsi"/>
+          <w:sz w:val="28"/>
+          <w:szCs w:val="28"/>
+        </w:rPr>
+        <w:t xml:space="preserve"> | 123456)</w:t>
       </w:r>
     </w:p>
     <w:p>
@@ -400,7 +3324,141 @@
           <w:sz w:val="28"/>
           <w:szCs w:val="28"/>
         </w:rPr>
-        <w:t>Vào danh sách học viên khóa học và thêm học viên vào khóa học</w:t>
+        <w:t xml:space="preserve">Bước 3: Chọn Khóa học </w:t>
+      </w:r>
+      <w:r>
+        <w:rPr>
+          <w:rFonts w:asciiTheme="majorHAnsi" w:hAnsiTheme="majorHAnsi" w:cstheme="majorHAnsi"/>
+          <w:sz w:val="28"/>
+          <w:szCs w:val="28"/>
+        </w:rPr>
+        <w:t>→</w:t>
+      </w:r>
+      <w:r>
+        <w:rPr>
+          <w:rFonts w:asciiTheme="majorHAnsi" w:hAnsiTheme="majorHAnsi" w:cstheme="majorHAnsi"/>
+          <w:sz w:val="28"/>
+          <w:szCs w:val="28"/>
+        </w:rPr>
+        <w:t xml:space="preserve"> </w:t>
+      </w:r>
+      <w:r>
+        <w:rPr>
+          <w:rFonts w:asciiTheme="majorHAnsi" w:hAnsiTheme="majorHAnsi" w:cstheme="majorHAnsi"/>
+          <w:sz w:val="28"/>
+          <w:szCs w:val="28"/>
+        </w:rPr>
+        <w:t xml:space="preserve">Thêm vào khóa học </w:t>
+      </w:r>
+      <w:r>
+        <w:rPr>
+          <w:rFonts w:asciiTheme="majorHAnsi" w:hAnsiTheme="majorHAnsi" w:cstheme="majorHAnsi"/>
+          <w:sz w:val="28"/>
+          <w:szCs w:val="28"/>
+        </w:rPr>
+        <w:t>→</w:t>
+      </w:r>
+      <w:r>
+        <w:rPr>
+          <w:rFonts w:asciiTheme="majorHAnsi" w:hAnsiTheme="majorHAnsi" w:cstheme="majorHAnsi"/>
+          <w:sz w:val="28"/>
+          <w:szCs w:val="28"/>
+        </w:rPr>
+        <w:t xml:space="preserve"> Danh sách học viên</w:t>
+      </w:r>
+    </w:p>
+    <w:p>
+      <w:pPr>
+        <w:pStyle w:val="ListParagraph"/>
+        <w:numPr>
+          <w:ilvl w:val="1"/>
+          <w:numId w:val="2"/>
+        </w:numPr>
+        <w:rPr>
+          <w:rFonts w:asciiTheme="majorHAnsi" w:hAnsiTheme="majorHAnsi" w:cstheme="majorHAnsi"/>
+          <w:sz w:val="28"/>
+          <w:szCs w:val="28"/>
+        </w:rPr>
+      </w:pPr>
+      <w:r>
+        <w:rPr>
+          <w:rFonts w:asciiTheme="majorHAnsi" w:hAnsiTheme="majorHAnsi" w:cstheme="majorHAnsi"/>
+          <w:sz w:val="28"/>
+          <w:szCs w:val="28"/>
+        </w:rPr>
+        <w:lastRenderedPageBreak/>
+        <w:t xml:space="preserve">Bước 4: </w:t>
+      </w:r>
+      <w:r>
+        <w:rPr>
+          <w:rFonts w:asciiTheme="majorHAnsi" w:hAnsiTheme="majorHAnsi" w:cstheme="majorHAnsi"/>
+          <w:sz w:val="28"/>
+          <w:szCs w:val="28"/>
+        </w:rPr>
+        <w:t>Chọn nhập excel để thêm hàng loạt file hoặc chọn thêm học viên để thêm thủ công</w:t>
+      </w:r>
+      <w:r>
+        <w:rPr>
+          <w:rFonts w:asciiTheme="majorHAnsi" w:hAnsiTheme="majorHAnsi" w:cstheme="majorHAnsi"/>
+          <w:sz w:val="28"/>
+          <w:szCs w:val="28"/>
+        </w:rPr>
+        <w:br/>
+        <w:t>(</w:t>
+      </w:r>
+      <w:r>
+        <w:rPr>
+          <w:rFonts w:asciiTheme="majorHAnsi" w:hAnsiTheme="majorHAnsi" w:cstheme="majorHAnsi"/>
+          <w:sz w:val="28"/>
+          <w:szCs w:val="28"/>
+        </w:rPr>
+        <w:t>File danh sách</w:t>
+      </w:r>
+      <w:r>
+        <w:rPr>
+          <w:rFonts w:asciiTheme="majorHAnsi" w:hAnsiTheme="majorHAnsi" w:cstheme="majorHAnsi"/>
+          <w:sz w:val="28"/>
+          <w:szCs w:val="28"/>
+        </w:rPr>
+        <w:t xml:space="preserve"> lớp</w:t>
+      </w:r>
+      <w:r>
+        <w:rPr>
+          <w:rFonts w:asciiTheme="majorHAnsi" w:hAnsiTheme="majorHAnsi" w:cstheme="majorHAnsi"/>
+          <w:sz w:val="28"/>
+          <w:szCs w:val="28"/>
+        </w:rPr>
+        <w:t xml:space="preserve"> mẫu có trong thư mục resources/database/ của dự </w:t>
+      </w:r>
+      <w:r>
+        <w:rPr>
+          <w:rFonts w:asciiTheme="majorHAnsi" w:hAnsiTheme="majorHAnsi" w:cstheme="majorHAnsi"/>
+          <w:sz w:val="28"/>
+          <w:szCs w:val="28"/>
+        </w:rPr>
+        <w:t>án)</w:t>
+      </w:r>
+    </w:p>
+    <w:p>
+      <w:pPr>
+        <w:pStyle w:val="ListParagraph"/>
+        <w:numPr>
+          <w:ilvl w:val="1"/>
+          <w:numId w:val="2"/>
+        </w:numPr>
+        <w:rPr>
+          <w:rFonts w:asciiTheme="majorHAnsi" w:hAnsiTheme="majorHAnsi" w:cstheme="majorHAnsi"/>
+          <w:sz w:val="28"/>
+          <w:szCs w:val="28"/>
+        </w:rPr>
+      </w:pPr>
+      <w:r>
+        <w:rPr>
+          <w:rFonts w:asciiTheme="majorHAnsi" w:hAnsiTheme="majorHAnsi" w:cstheme="majorHAnsi"/>
+          <w:sz w:val="28"/>
+          <w:szCs w:val="28"/>
+        </w:rPr>
+        <w:t>Bước 5: Nhấn xác nhận và nhập dữ liệu</w:t>
       </w:r>
     </w:p>
     <w:p>
@@ -412,13 +3470,17 @@
         </w:numPr>
         <w:rPr>
           <w:rFonts w:asciiTheme="majorHAnsi" w:hAnsiTheme="majorHAnsi" w:cstheme="majorHAnsi"/>
-          <w:sz w:val="28"/>
-          <w:szCs w:val="28"/>
-        </w:rPr>
-      </w:pPr>
-      <w:r>
-        <w:rPr>
-          <w:rFonts w:asciiTheme="majorHAnsi" w:hAnsiTheme="majorHAnsi" w:cstheme="majorHAnsi"/>
+          <w:b/>
+          <w:bCs/>
+          <w:sz w:val="28"/>
+          <w:szCs w:val="28"/>
+        </w:rPr>
+      </w:pPr>
+      <w:r>
+        <w:rPr>
+          <w:rFonts w:asciiTheme="majorHAnsi" w:hAnsiTheme="majorHAnsi" w:cstheme="majorHAnsi"/>
+          <w:b/>
+          <w:bCs/>
           <w:sz w:val="28"/>
           <w:szCs w:val="28"/>
         </w:rPr>
@@ -444,7 +3506,26 @@
           <w:sz w:val="28"/>
           <w:szCs w:val="28"/>
         </w:rPr>
-        <w:t>Đăng nhập tài khoản Student được thêm vào khóa học</w:t>
+        <w:t xml:space="preserve">Bước 1: Truy cập trang client ( </w:t>
+      </w:r>
+      <w:hyperlink r:id="rId12" w:history="1">
+        <w:r>
+          <w:rPr>
+            <w:rStyle w:val="Hyperlink"/>
+            <w:rFonts w:asciiTheme="majorHAnsi" w:hAnsiTheme="majorHAnsi" w:cstheme="majorHAnsi"/>
+            <w:sz w:val="28"/>
+            <w:szCs w:val="28"/>
+          </w:rPr>
+          <w:t>http://localhost:8080</w:t>
+        </w:r>
+      </w:hyperlink>
+      <w:r>
+        <w:rPr>
+          <w:rFonts w:asciiTheme="majorHAnsi" w:hAnsiTheme="majorHAnsi" w:cstheme="majorHAnsi"/>
+          <w:sz w:val="28"/>
+          <w:szCs w:val="28"/>
+        </w:rPr>
+        <w:t xml:space="preserve"> )</w:t>
       </w:r>
     </w:p>
     <w:p>
@@ -466,7 +3547,40 @@
           <w:sz w:val="28"/>
           <w:szCs w:val="28"/>
         </w:rPr>
-        <w:t>Sau khi được thêm vào khóa học thì truy cập vào khóa học</w:t>
+        <w:t xml:space="preserve">Bước 2: Đăng nhập tài khoản </w:t>
+      </w:r>
+      <w:r>
+        <w:rPr>
+          <w:rFonts w:asciiTheme="majorHAnsi" w:hAnsiTheme="majorHAnsi" w:cstheme="majorHAnsi"/>
+          <w:sz w:val="28"/>
+          <w:szCs w:val="28"/>
+        </w:rPr>
+        <w:t>Student được thêm vào khóa học</w:t>
+      </w:r>
+      <w:r>
+        <w:rPr>
+          <w:rFonts w:asciiTheme="majorHAnsi" w:hAnsiTheme="majorHAnsi" w:cstheme="majorHAnsi"/>
+          <w:sz w:val="28"/>
+          <w:szCs w:val="28"/>
+        </w:rPr>
+        <w:br/>
+        <w:t>(</w:t>
+      </w:r>
+      <w:r>
+        <w:rPr>
+          <w:rFonts w:asciiTheme="majorHAnsi" w:hAnsiTheme="majorHAnsi" w:cstheme="majorHAnsi"/>
+          <w:sz w:val="28"/>
+          <w:szCs w:val="28"/>
+        </w:rPr>
+        <w:t>jane@student.com</w:t>
+      </w:r>
+      <w:r>
+        <w:rPr>
+          <w:rFonts w:asciiTheme="majorHAnsi" w:hAnsiTheme="majorHAnsi" w:cstheme="majorHAnsi"/>
+          <w:sz w:val="28"/>
+          <w:szCs w:val="28"/>
+        </w:rPr>
+        <w:t xml:space="preserve"> | 123456)</w:t>
       </w:r>
     </w:p>
     <w:p>
@@ -488,15 +3602,7 @@
           <w:sz w:val="28"/>
           <w:szCs w:val="28"/>
         </w:rPr>
-        <w:t>Xem video</w:t>
-      </w:r>
-      <w:r>
-        <w:rPr>
-          <w:rFonts w:asciiTheme="majorHAnsi" w:hAnsiTheme="majorHAnsi" w:cstheme="majorHAnsi"/>
-          <w:sz w:val="28"/>
-          <w:szCs w:val="28"/>
-        </w:rPr>
-        <w:t xml:space="preserve"> bài giảng</w:t>
+        <w:t>Bước 3: Chọn khóa học đã tham gia</w:t>
       </w:r>
     </w:p>
     <w:p>
@@ -518,7 +3624,53 @@
           <w:sz w:val="28"/>
           <w:szCs w:val="28"/>
         </w:rPr>
-        <w:t>Làm quiz</w:t>
+        <w:t>Bước 4: Chọn video để x</w:t>
+      </w:r>
+      <w:r>
+        <w:rPr>
+          <w:rFonts w:asciiTheme="majorHAnsi" w:hAnsiTheme="majorHAnsi" w:cstheme="majorHAnsi"/>
+          <w:sz w:val="28"/>
+          <w:szCs w:val="28"/>
+        </w:rPr>
+        <w:t>em video</w:t>
+      </w:r>
+      <w:r>
+        <w:rPr>
+          <w:rFonts w:asciiTheme="majorHAnsi" w:hAnsiTheme="majorHAnsi" w:cstheme="majorHAnsi"/>
+          <w:sz w:val="28"/>
+          <w:szCs w:val="28"/>
+        </w:rPr>
+        <w:t xml:space="preserve"> bài giảng</w:t>
+      </w:r>
+    </w:p>
+    <w:p>
+      <w:pPr>
+        <w:pStyle w:val="ListParagraph"/>
+        <w:numPr>
+          <w:ilvl w:val="1"/>
+          <w:numId w:val="2"/>
+        </w:numPr>
+        <w:rPr>
+          <w:rFonts w:asciiTheme="majorHAnsi" w:hAnsiTheme="majorHAnsi" w:cstheme="majorHAnsi"/>
+          <w:sz w:val="28"/>
+          <w:szCs w:val="28"/>
+        </w:rPr>
+      </w:pPr>
+      <w:r>
+        <w:rPr>
+          <w:rFonts w:asciiTheme="majorHAnsi" w:hAnsiTheme="majorHAnsi" w:cstheme="majorHAnsi"/>
+          <w:sz w:val="28"/>
+          <w:szCs w:val="28"/>
+        </w:rPr>
+        <w:t>Bước 5: Chọn quiz để làm bài quiz</w:t>
+      </w:r>
+      <w:r>
+        <w:rPr>
+          <w:rFonts w:asciiTheme="majorHAnsi" w:hAnsiTheme="majorHAnsi" w:cstheme="majorHAnsi"/>
+          <w:sz w:val="28"/>
+          <w:szCs w:val="28"/>
+        </w:rPr>
+        <w:br/>
       </w:r>
       <w:r>
         <w:rPr>
@@ -527,7 +3679,42 @@
           <w:szCs w:val="28"/>
           <w:lang w:val="en-US"/>
         </w:rPr>
-        <w:t xml:space="preserve"> (Chỉ</w:t>
+        <w:t>(</w:t>
+      </w:r>
+      <w:r>
+        <w:rPr>
+          <w:rFonts w:asciiTheme="majorHAnsi" w:hAnsiTheme="majorHAnsi" w:cstheme="majorHAnsi"/>
+          <w:sz w:val="28"/>
+          <w:szCs w:val="28"/>
+          <w:lang w:val="en-US"/>
+        </w:rPr>
+        <w:t>Quiz</w:t>
+      </w:r>
+      <w:r>
+        <w:rPr>
+          <w:rFonts w:asciiTheme="majorHAnsi" w:hAnsiTheme="majorHAnsi" w:cstheme="majorHAnsi"/>
+          <w:sz w:val="28"/>
+          <w:szCs w:val="28"/>
+        </w:rPr>
+        <w:t xml:space="preserve"> được làm tối đa 3 lần, </w:t>
+      </w:r>
+      <w:r>
+        <w:rPr>
+          <w:rFonts w:asciiTheme="majorHAnsi" w:hAnsiTheme="majorHAnsi" w:cstheme="majorHAnsi"/>
+          <w:sz w:val="28"/>
+          <w:szCs w:val="28"/>
+          <w:lang w:val="en-US"/>
+        </w:rPr>
+        <w:t>c</w:t>
+      </w:r>
+      <w:r>
+        <w:rPr>
+          <w:rFonts w:asciiTheme="majorHAnsi" w:hAnsiTheme="majorHAnsi" w:cstheme="majorHAnsi"/>
+          <w:sz w:val="28"/>
+          <w:szCs w:val="28"/>
+          <w:lang w:val="en-US"/>
+        </w:rPr>
+        <w:t>hỉ</w:t>
       </w:r>
       <w:r>
         <w:rPr>
@@ -547,13 +3734,17 @@
         </w:numPr>
         <w:rPr>
           <w:rFonts w:asciiTheme="majorHAnsi" w:hAnsiTheme="majorHAnsi" w:cstheme="majorHAnsi"/>
-          <w:sz w:val="28"/>
-          <w:szCs w:val="28"/>
-        </w:rPr>
-      </w:pPr>
-      <w:r>
-        <w:rPr>
-          <w:rFonts w:asciiTheme="majorHAnsi" w:hAnsiTheme="majorHAnsi" w:cstheme="majorHAnsi"/>
+          <w:b/>
+          <w:bCs/>
+          <w:sz w:val="28"/>
+          <w:szCs w:val="28"/>
+        </w:rPr>
+      </w:pPr>
+      <w:r>
+        <w:rPr>
+          <w:rFonts w:asciiTheme="majorHAnsi" w:hAnsiTheme="majorHAnsi" w:cstheme="majorHAnsi"/>
+          <w:b/>
+          <w:bCs/>
           <w:sz w:val="28"/>
           <w:szCs w:val="28"/>
         </w:rPr>
@@ -579,7 +3770,26 @@
           <w:sz w:val="28"/>
           <w:szCs w:val="28"/>
         </w:rPr>
-        <w:t>Đăng nhập tài khoản Student</w:t>
+        <w:t xml:space="preserve">Bước 1: Truy cập trang client ( </w:t>
+      </w:r>
+      <w:hyperlink r:id="rId13" w:history="1">
+        <w:r>
+          <w:rPr>
+            <w:rStyle w:val="Hyperlink"/>
+            <w:rFonts w:asciiTheme="majorHAnsi" w:hAnsiTheme="majorHAnsi" w:cstheme="majorHAnsi"/>
+            <w:sz w:val="28"/>
+            <w:szCs w:val="28"/>
+          </w:rPr>
+          <w:t>http://localhost:8080</w:t>
+        </w:r>
+      </w:hyperlink>
+      <w:r>
+        <w:rPr>
+          <w:rFonts w:asciiTheme="majorHAnsi" w:hAnsiTheme="majorHAnsi" w:cstheme="majorHAnsi"/>
+          <w:sz w:val="28"/>
+          <w:szCs w:val="28"/>
+        </w:rPr>
+        <w:t xml:space="preserve"> )</w:t>
       </w:r>
     </w:p>
     <w:p>
@@ -601,31 +3811,39 @@
           <w:sz w:val="28"/>
           <w:szCs w:val="28"/>
         </w:rPr>
-        <w:t xml:space="preserve">Xem </w:t>
-      </w:r>
-      <w:r>
-        <w:rPr>
-          <w:rFonts w:asciiTheme="majorHAnsi" w:hAnsiTheme="majorHAnsi" w:cstheme="majorHAnsi"/>
-          <w:sz w:val="28"/>
-          <w:szCs w:val="28"/>
-        </w:rPr>
-        <w:t xml:space="preserve">danh sách </w:t>
-      </w:r>
-      <w:r>
-        <w:rPr>
-          <w:rFonts w:asciiTheme="majorHAnsi" w:hAnsiTheme="majorHAnsi" w:cstheme="majorHAnsi"/>
-          <w:sz w:val="28"/>
-          <w:szCs w:val="28"/>
-        </w:rPr>
-        <w:t>tiến độ làm quiz</w:t>
-      </w:r>
-      <w:r>
-        <w:rPr>
-          <w:rFonts w:asciiTheme="majorHAnsi" w:hAnsiTheme="majorHAnsi" w:cstheme="majorHAnsi"/>
-          <w:sz w:val="28"/>
-          <w:szCs w:val="28"/>
-        </w:rPr>
-        <w:t xml:space="preserve"> cá nhân các khóa học</w:t>
+        <w:t>Bước 2: Đăng nhập tài khoản</w:t>
+      </w:r>
+      <w:r>
+        <w:rPr>
+          <w:rFonts w:asciiTheme="majorHAnsi" w:hAnsiTheme="majorHAnsi" w:cstheme="majorHAnsi"/>
+          <w:sz w:val="28"/>
+          <w:szCs w:val="28"/>
+        </w:rPr>
+        <w:t xml:space="preserve"> </w:t>
+      </w:r>
+      <w:r>
+        <w:rPr>
+          <w:rFonts w:asciiTheme="majorHAnsi" w:hAnsiTheme="majorHAnsi" w:cstheme="majorHAnsi"/>
+          <w:sz w:val="28"/>
+          <w:szCs w:val="28"/>
+        </w:rPr>
+        <w:t>(</w:t>
+      </w:r>
+      <w:r>
+        <w:rPr>
+          <w:rFonts w:asciiTheme="majorHAnsi" w:hAnsiTheme="majorHAnsi" w:cstheme="majorHAnsi"/>
+          <w:sz w:val="28"/>
+          <w:szCs w:val="28"/>
+        </w:rPr>
+        <w:t>jane@student.com</w:t>
+      </w:r>
+      <w:r>
+        <w:rPr>
+          <w:rFonts w:asciiTheme="majorHAnsi" w:hAnsiTheme="majorHAnsi" w:cstheme="majorHAnsi"/>
+          <w:sz w:val="28"/>
+          <w:szCs w:val="28"/>
+        </w:rPr>
+        <w:t xml:space="preserve"> | 123456)</w:t>
       </w:r>
     </w:p>
     <w:p>
@@ -647,7 +3865,75 @@
           <w:sz w:val="28"/>
           <w:szCs w:val="28"/>
         </w:rPr>
-        <w:t>Lọc theo danh sách theo khóa học</w:t>
+        <w:t>Bước 3: Di chuột đến email trên header để mở hộp thoại dropdown</w:t>
+      </w:r>
+    </w:p>
+    <w:p>
+      <w:pPr>
+        <w:pStyle w:val="ListParagraph"/>
+        <w:numPr>
+          <w:ilvl w:val="1"/>
+          <w:numId w:val="2"/>
+        </w:numPr>
+        <w:rPr>
+          <w:rFonts w:asciiTheme="majorHAnsi" w:hAnsiTheme="majorHAnsi" w:cstheme="majorHAnsi"/>
+          <w:sz w:val="28"/>
+          <w:szCs w:val="28"/>
+        </w:rPr>
+      </w:pPr>
+      <w:r>
+        <w:rPr>
+          <w:rFonts w:asciiTheme="majorHAnsi" w:hAnsiTheme="majorHAnsi" w:cstheme="majorHAnsi"/>
+          <w:sz w:val="28"/>
+          <w:szCs w:val="28"/>
+        </w:rPr>
+        <w:t xml:space="preserve">Bước 4: Chọn bảng điều khiển </w:t>
+      </w:r>
+      <w:r>
+        <w:rPr>
+          <w:rFonts w:asciiTheme="majorHAnsi" w:hAnsiTheme="majorHAnsi" w:cstheme="majorHAnsi"/>
+          <w:sz w:val="28"/>
+          <w:szCs w:val="28"/>
+        </w:rPr>
+        <w:t>→</w:t>
+      </w:r>
+      <w:r>
+        <w:rPr>
+          <w:rFonts w:asciiTheme="majorHAnsi" w:hAnsiTheme="majorHAnsi" w:cstheme="majorHAnsi"/>
+          <w:sz w:val="28"/>
+          <w:szCs w:val="28"/>
+        </w:rPr>
+        <w:t xml:space="preserve"> Tiến độ</w:t>
+      </w:r>
+    </w:p>
+    <w:p>
+      <w:pPr>
+        <w:pStyle w:val="ListParagraph"/>
+        <w:numPr>
+          <w:ilvl w:val="1"/>
+          <w:numId w:val="2"/>
+        </w:numPr>
+        <w:rPr>
+          <w:rFonts w:asciiTheme="majorHAnsi" w:hAnsiTheme="majorHAnsi" w:cstheme="majorHAnsi"/>
+          <w:sz w:val="28"/>
+          <w:szCs w:val="28"/>
+        </w:rPr>
+      </w:pPr>
+      <w:r>
+        <w:rPr>
+          <w:rFonts w:asciiTheme="majorHAnsi" w:hAnsiTheme="majorHAnsi" w:cstheme="majorHAnsi"/>
+          <w:sz w:val="28"/>
+          <w:szCs w:val="28"/>
+        </w:rPr>
+        <w:t>Bước 5: Hiển thị danh sách tiến độ các khóa học và có thể l</w:t>
+      </w:r>
+      <w:r>
+        <w:rPr>
+          <w:rFonts w:asciiTheme="majorHAnsi" w:hAnsiTheme="majorHAnsi" w:cstheme="majorHAnsi"/>
+          <w:sz w:val="28"/>
+          <w:szCs w:val="28"/>
+        </w:rPr>
+        <w:t>ọc danh sách theo khóa học</w:t>
       </w:r>
     </w:p>
     <w:p>
@@ -659,13 +3945,17 @@
         </w:numPr>
         <w:rPr>
           <w:rFonts w:asciiTheme="majorHAnsi" w:hAnsiTheme="majorHAnsi" w:cstheme="majorHAnsi"/>
-          <w:sz w:val="28"/>
-          <w:szCs w:val="28"/>
-        </w:rPr>
-      </w:pPr>
-      <w:r>
-        <w:rPr>
-          <w:rFonts w:asciiTheme="majorHAnsi" w:hAnsiTheme="majorHAnsi" w:cstheme="majorHAnsi"/>
+          <w:b/>
+          <w:bCs/>
+          <w:sz w:val="28"/>
+          <w:szCs w:val="28"/>
+        </w:rPr>
+      </w:pPr>
+      <w:r>
+        <w:rPr>
+          <w:rFonts w:asciiTheme="majorHAnsi" w:hAnsiTheme="majorHAnsi" w:cstheme="majorHAnsi"/>
+          <w:b/>
+          <w:bCs/>
           <w:sz w:val="28"/>
           <w:szCs w:val="28"/>
         </w:rPr>
@@ -691,7 +3981,26 @@
           <w:sz w:val="28"/>
           <w:szCs w:val="28"/>
         </w:rPr>
-        <w:t>Đăng nhập tài khoản Instructor</w:t>
+        <w:t xml:space="preserve">Bước 1: Truy cập trang client ( </w:t>
+      </w:r>
+      <w:hyperlink r:id="rId14" w:history="1">
+        <w:r>
+          <w:rPr>
+            <w:rStyle w:val="Hyperlink"/>
+            <w:rFonts w:asciiTheme="majorHAnsi" w:hAnsiTheme="majorHAnsi" w:cstheme="majorHAnsi"/>
+            <w:sz w:val="28"/>
+            <w:szCs w:val="28"/>
+          </w:rPr>
+          <w:t>http://localhost:8080</w:t>
+        </w:r>
+      </w:hyperlink>
+      <w:r>
+        <w:rPr>
+          <w:rFonts w:asciiTheme="majorHAnsi" w:hAnsiTheme="majorHAnsi" w:cstheme="majorHAnsi"/>
+          <w:sz w:val="28"/>
+          <w:szCs w:val="28"/>
+        </w:rPr>
+        <w:t xml:space="preserve"> )</w:t>
       </w:r>
     </w:p>
     <w:p>
@@ -713,7 +4022,32 @@
           <w:sz w:val="28"/>
           <w:szCs w:val="28"/>
         </w:rPr>
-        <w:t>Xem danh sách học viên và tiến độ của từng người theo khóa học</w:t>
+        <w:t>Bước 2: Đăng nhập tài khoản Instructor</w:t>
+      </w:r>
+      <w:r>
+        <w:rPr>
+          <w:rFonts w:asciiTheme="majorHAnsi" w:hAnsiTheme="majorHAnsi" w:cstheme="majorHAnsi"/>
+          <w:sz w:val="28"/>
+          <w:szCs w:val="28"/>
+        </w:rPr>
+        <w:br/>
+        <w:t>(</w:t>
+      </w:r>
+      <w:r>
+        <w:rPr>
+          <w:rFonts w:asciiTheme="majorHAnsi" w:hAnsiTheme="majorHAnsi" w:cstheme="majorHAnsi"/>
+          <w:sz w:val="28"/>
+          <w:szCs w:val="28"/>
+        </w:rPr>
+        <w:t>john@viettutor.com</w:t>
+      </w:r>
+      <w:r>
+        <w:rPr>
+          <w:rFonts w:asciiTheme="majorHAnsi" w:hAnsiTheme="majorHAnsi" w:cstheme="majorHAnsi"/>
+          <w:sz w:val="28"/>
+          <w:szCs w:val="28"/>
+        </w:rPr>
+        <w:t xml:space="preserve"> | 123456)</w:t>
       </w:r>
     </w:p>
     <w:p>
@@ -735,7 +4069,105 @@
           <w:sz w:val="28"/>
           <w:szCs w:val="28"/>
         </w:rPr>
-        <w:t>Lọc danh sách theo khóa học</w:t>
+        <w:t>Bước 3: Di chuột đến email trên header để mở hộp thoại dropdown</w:t>
+      </w:r>
+    </w:p>
+    <w:p>
+      <w:pPr>
+        <w:pStyle w:val="ListParagraph"/>
+        <w:numPr>
+          <w:ilvl w:val="1"/>
+          <w:numId w:val="2"/>
+        </w:numPr>
+        <w:rPr>
+          <w:rFonts w:asciiTheme="majorHAnsi" w:hAnsiTheme="majorHAnsi" w:cstheme="majorHAnsi"/>
+          <w:sz w:val="28"/>
+          <w:szCs w:val="28"/>
+        </w:rPr>
+      </w:pPr>
+      <w:r>
+        <w:rPr>
+          <w:rFonts w:asciiTheme="majorHAnsi" w:hAnsiTheme="majorHAnsi" w:cstheme="majorHAnsi"/>
+          <w:sz w:val="28"/>
+          <w:szCs w:val="28"/>
+        </w:rPr>
+        <w:t xml:space="preserve">Bước 4: Chọn Bảng điều khiển </w:t>
+      </w:r>
+      <w:r>
+        <w:rPr>
+          <w:rFonts w:asciiTheme="majorHAnsi" w:hAnsiTheme="majorHAnsi" w:cstheme="majorHAnsi"/>
+          <w:sz w:val="28"/>
+          <w:szCs w:val="28"/>
+        </w:rPr>
+        <w:t>→</w:t>
+      </w:r>
+      <w:r>
+        <w:rPr>
+          <w:rFonts w:asciiTheme="majorHAnsi" w:hAnsiTheme="majorHAnsi" w:cstheme="majorHAnsi"/>
+          <w:sz w:val="28"/>
+          <w:szCs w:val="28"/>
+        </w:rPr>
+        <w:t xml:space="preserve"> </w:t>
+      </w:r>
+      <w:r>
+        <w:rPr>
+          <w:rFonts w:asciiTheme="majorHAnsi" w:hAnsiTheme="majorHAnsi" w:cstheme="majorHAnsi"/>
+          <w:sz w:val="28"/>
+          <w:szCs w:val="28"/>
+        </w:rPr>
+        <w:t>Thống kê Quizz</w:t>
+      </w:r>
+    </w:p>
+    <w:p>
+      <w:pPr>
+        <w:pStyle w:val="ListParagraph"/>
+        <w:numPr>
+          <w:ilvl w:val="1"/>
+          <w:numId w:val="2"/>
+        </w:numPr>
+        <w:rPr>
+          <w:rFonts w:asciiTheme="majorHAnsi" w:hAnsiTheme="majorHAnsi" w:cstheme="majorHAnsi"/>
+          <w:sz w:val="28"/>
+          <w:szCs w:val="28"/>
+        </w:rPr>
+      </w:pPr>
+      <w:r>
+        <w:rPr>
+          <w:rFonts w:asciiTheme="majorHAnsi" w:hAnsiTheme="majorHAnsi" w:cstheme="majorHAnsi"/>
+          <w:sz w:val="28"/>
+          <w:szCs w:val="28"/>
+        </w:rPr>
+        <w:t>Bước 5: Chọn lọc danh sách theo khóa học và nhấn lọc</w:t>
+      </w:r>
+    </w:p>
+    <w:p>
+      <w:pPr>
+        <w:pStyle w:val="ListParagraph"/>
+        <w:numPr>
+          <w:ilvl w:val="1"/>
+          <w:numId w:val="2"/>
+        </w:numPr>
+        <w:rPr>
+          <w:rFonts w:asciiTheme="majorHAnsi" w:hAnsiTheme="majorHAnsi" w:cstheme="majorHAnsi"/>
+          <w:sz w:val="28"/>
+          <w:szCs w:val="28"/>
+        </w:rPr>
+      </w:pPr>
+      <w:r>
+        <w:rPr>
+          <w:rFonts w:asciiTheme="majorHAnsi" w:hAnsiTheme="majorHAnsi" w:cstheme="majorHAnsi"/>
+          <w:sz w:val="28"/>
+          <w:szCs w:val="28"/>
+        </w:rPr>
+        <w:t xml:space="preserve">Bước 6: </w:t>
+      </w:r>
+      <w:r>
+        <w:rPr>
+          <w:rFonts w:asciiTheme="majorHAnsi" w:hAnsiTheme="majorHAnsi" w:cstheme="majorHAnsi"/>
+          <w:sz w:val="28"/>
+          <w:szCs w:val="28"/>
+        </w:rPr>
+        <w:t>Xem danh sách học viên và tiến độ của từng người theo khóa học</w:t>
       </w:r>
     </w:p>
     <w:sectPr>
@@ -753,7 +4185,7 @@
   <w:abstractNum w:abstractNumId="0" w15:restartNumberingAfterBreak="0">
     <w:nsid w:val="06FE680C"/>
     <w:multiLevelType w:val="hybridMultilevel"/>
-    <w:tmpl w:val="FDBCB8AC"/>
+    <w:tmpl w:val="031E071C"/>
     <w:lvl w:ilvl="0" w:tplc="042A000F">
       <w:start w:val="1"/>
       <w:numFmt w:val="decimal"/>
@@ -778,14 +4210,17 @@
         <w:rFonts w:ascii="Symbol" w:hAnsi="Symbol" w:hint="default"/>
       </w:rPr>
     </w:lvl>
-    <w:lvl w:ilvl="2" w:tplc="042A001B" w:tentative="1">
+    <w:lvl w:ilvl="2" w:tplc="042A0003">
       <w:start w:val="1"/>
-      <w:numFmt w:val="lowerRoman"/>
-      <w:lvlText w:val="%3."/>
-      <w:lvlJc w:val="right"/>
-      <w:pPr>
-        <w:ind w:left="2160" w:hanging="180"/>
-      </w:pPr>
+      <w:numFmt w:val="bullet"/>
+      <w:lvlText w:val="o"/>
+      <w:lvlJc w:val="left"/>
+      <w:pPr>
+        <w:ind w:left="2340" w:hanging="360"/>
+      </w:pPr>
+      <w:rPr>
+        <w:rFonts w:ascii="Courier New" w:hAnsi="Courier New" w:cs="Courier New" w:hint="default"/>
+      </w:rPr>
     </w:lvl>
     <w:lvl w:ilvl="3" w:tplc="042A000F" w:tentative="1">
       <w:start w:val="1"/>
@@ -931,11 +4366,315 @@
       </w:pPr>
     </w:lvl>
   </w:abstractNum>
+  <w:abstractNum w:abstractNumId="2" w15:restartNumberingAfterBreak="0">
+    <w:nsid w:val="25026968"/>
+    <w:multiLevelType w:val="multilevel"/>
+    <w:tmpl w:val="1E20F90E"/>
+    <w:lvl w:ilvl="0">
+      <w:start w:val="1"/>
+      <w:numFmt w:val="bullet"/>
+      <w:lvlText w:val=""/>
+      <w:lvlJc w:val="left"/>
+      <w:pPr>
+        <w:tabs>
+          <w:tab w:val="num" w:pos="720"/>
+        </w:tabs>
+        <w:ind w:left="720" w:hanging="360"/>
+      </w:pPr>
+      <w:rPr>
+        <w:rFonts w:ascii="Symbol" w:hAnsi="Symbol" w:hint="default"/>
+        <w:sz w:val="20"/>
+      </w:rPr>
+    </w:lvl>
+    <w:lvl w:ilvl="1" w:tentative="1">
+      <w:start w:val="1"/>
+      <w:numFmt w:val="bullet"/>
+      <w:lvlText w:val="o"/>
+      <w:lvlJc w:val="left"/>
+      <w:pPr>
+        <w:tabs>
+          <w:tab w:val="num" w:pos="1440"/>
+        </w:tabs>
+        <w:ind w:left="1440" w:hanging="360"/>
+      </w:pPr>
+      <w:rPr>
+        <w:rFonts w:ascii="Courier New" w:hAnsi="Courier New" w:hint="default"/>
+        <w:sz w:val="20"/>
+      </w:rPr>
+    </w:lvl>
+    <w:lvl w:ilvl="2" w:tentative="1">
+      <w:start w:val="1"/>
+      <w:numFmt w:val="bullet"/>
+      <w:lvlText w:val=""/>
+      <w:lvlJc w:val="left"/>
+      <w:pPr>
+        <w:tabs>
+          <w:tab w:val="num" w:pos="2160"/>
+        </w:tabs>
+        <w:ind w:left="2160" w:hanging="360"/>
+      </w:pPr>
+      <w:rPr>
+        <w:rFonts w:ascii="Wingdings" w:hAnsi="Wingdings" w:hint="default"/>
+        <w:sz w:val="20"/>
+      </w:rPr>
+    </w:lvl>
+    <w:lvl w:ilvl="3" w:tentative="1">
+      <w:start w:val="1"/>
+      <w:numFmt w:val="bullet"/>
+      <w:lvlText w:val=""/>
+      <w:lvlJc w:val="left"/>
+      <w:pPr>
+        <w:tabs>
+          <w:tab w:val="num" w:pos="2880"/>
+        </w:tabs>
+        <w:ind w:left="2880" w:hanging="360"/>
+      </w:pPr>
+      <w:rPr>
+        <w:rFonts w:ascii="Wingdings" w:hAnsi="Wingdings" w:hint="default"/>
+        <w:sz w:val="20"/>
+      </w:rPr>
+    </w:lvl>
+    <w:lvl w:ilvl="4" w:tentative="1">
+      <w:start w:val="1"/>
+      <w:numFmt w:val="bullet"/>
+      <w:lvlText w:val=""/>
+      <w:lvlJc w:val="left"/>
+      <w:pPr>
+        <w:tabs>
+          <w:tab w:val="num" w:pos="3600"/>
+        </w:tabs>
+        <w:ind w:left="3600" w:hanging="360"/>
+      </w:pPr>
+      <w:rPr>
+        <w:rFonts w:ascii="Wingdings" w:hAnsi="Wingdings" w:hint="default"/>
+        <w:sz w:val="20"/>
+      </w:rPr>
+    </w:lvl>
+    <w:lvl w:ilvl="5" w:tentative="1">
+      <w:start w:val="1"/>
+      <w:numFmt w:val="bullet"/>
+      <w:lvlText w:val=""/>
+      <w:lvlJc w:val="left"/>
+      <w:pPr>
+        <w:tabs>
+          <w:tab w:val="num" w:pos="4320"/>
+        </w:tabs>
+        <w:ind w:left="4320" w:hanging="360"/>
+      </w:pPr>
+      <w:rPr>
+        <w:rFonts w:ascii="Wingdings" w:hAnsi="Wingdings" w:hint="default"/>
+        <w:sz w:val="20"/>
+      </w:rPr>
+    </w:lvl>
+    <w:lvl w:ilvl="6" w:tentative="1">
+      <w:start w:val="1"/>
+      <w:numFmt w:val="bullet"/>
+      <w:lvlText w:val=""/>
+      <w:lvlJc w:val="left"/>
+      <w:pPr>
+        <w:tabs>
+          <w:tab w:val="num" w:pos="5040"/>
+        </w:tabs>
+        <w:ind w:left="5040" w:hanging="360"/>
+      </w:pPr>
+      <w:rPr>
+        <w:rFonts w:ascii="Wingdings" w:hAnsi="Wingdings" w:hint="default"/>
+        <w:sz w:val="20"/>
+      </w:rPr>
+    </w:lvl>
+    <w:lvl w:ilvl="7" w:tentative="1">
+      <w:start w:val="1"/>
+      <w:numFmt w:val="bullet"/>
+      <w:lvlText w:val=""/>
+      <w:lvlJc w:val="left"/>
+      <w:pPr>
+        <w:tabs>
+          <w:tab w:val="num" w:pos="5760"/>
+        </w:tabs>
+        <w:ind w:left="5760" w:hanging="360"/>
+      </w:pPr>
+      <w:rPr>
+        <w:rFonts w:ascii="Wingdings" w:hAnsi="Wingdings" w:hint="default"/>
+        <w:sz w:val="20"/>
+      </w:rPr>
+    </w:lvl>
+    <w:lvl w:ilvl="8" w:tentative="1">
+      <w:start w:val="1"/>
+      <w:numFmt w:val="bullet"/>
+      <w:lvlText w:val=""/>
+      <w:lvlJc w:val="left"/>
+      <w:pPr>
+        <w:tabs>
+          <w:tab w:val="num" w:pos="6480"/>
+        </w:tabs>
+        <w:ind w:left="6480" w:hanging="360"/>
+      </w:pPr>
+      <w:rPr>
+        <w:rFonts w:ascii="Wingdings" w:hAnsi="Wingdings" w:hint="default"/>
+        <w:sz w:val="20"/>
+      </w:rPr>
+    </w:lvl>
+  </w:abstractNum>
+  <w:abstractNum w:abstractNumId="3" w15:restartNumberingAfterBreak="0">
+    <w:nsid w:val="691E6FB0"/>
+    <w:multiLevelType w:val="multilevel"/>
+    <w:tmpl w:val="26CE0902"/>
+    <w:lvl w:ilvl="0">
+      <w:start w:val="1"/>
+      <w:numFmt w:val="bullet"/>
+      <w:lvlText w:val=""/>
+      <w:lvlJc w:val="left"/>
+      <w:pPr>
+        <w:tabs>
+          <w:tab w:val="num" w:pos="720"/>
+        </w:tabs>
+        <w:ind w:left="720" w:hanging="360"/>
+      </w:pPr>
+      <w:rPr>
+        <w:rFonts w:ascii="Symbol" w:hAnsi="Symbol" w:hint="default"/>
+        <w:sz w:val="20"/>
+      </w:rPr>
+    </w:lvl>
+    <w:lvl w:ilvl="1" w:tentative="1">
+      <w:start w:val="1"/>
+      <w:numFmt w:val="bullet"/>
+      <w:lvlText w:val="o"/>
+      <w:lvlJc w:val="left"/>
+      <w:pPr>
+        <w:tabs>
+          <w:tab w:val="num" w:pos="1440"/>
+        </w:tabs>
+        <w:ind w:left="1440" w:hanging="360"/>
+      </w:pPr>
+      <w:rPr>
+        <w:rFonts w:ascii="Courier New" w:hAnsi="Courier New" w:hint="default"/>
+        <w:sz w:val="20"/>
+      </w:rPr>
+    </w:lvl>
+    <w:lvl w:ilvl="2" w:tentative="1">
+      <w:start w:val="1"/>
+      <w:numFmt w:val="bullet"/>
+      <w:lvlText w:val=""/>
+      <w:lvlJc w:val="left"/>
+      <w:pPr>
+        <w:tabs>
+          <w:tab w:val="num" w:pos="2160"/>
+        </w:tabs>
+        <w:ind w:left="2160" w:hanging="360"/>
+      </w:pPr>
+      <w:rPr>
+        <w:rFonts w:ascii="Wingdings" w:hAnsi="Wingdings" w:hint="default"/>
+        <w:sz w:val="20"/>
+      </w:rPr>
+    </w:lvl>
+    <w:lvl w:ilvl="3" w:tentative="1">
+      <w:start w:val="1"/>
+      <w:numFmt w:val="bullet"/>
+      <w:lvlText w:val=""/>
+      <w:lvlJc w:val="left"/>
+      <w:pPr>
+        <w:tabs>
+          <w:tab w:val="num" w:pos="2880"/>
+        </w:tabs>
+        <w:ind w:left="2880" w:hanging="360"/>
+      </w:pPr>
+      <w:rPr>
+        <w:rFonts w:ascii="Wingdings" w:hAnsi="Wingdings" w:hint="default"/>
+        <w:sz w:val="20"/>
+      </w:rPr>
+    </w:lvl>
+    <w:lvl w:ilvl="4" w:tentative="1">
+      <w:start w:val="1"/>
+      <w:numFmt w:val="bullet"/>
+      <w:lvlText w:val=""/>
+      <w:lvlJc w:val="left"/>
+      <w:pPr>
+        <w:tabs>
+          <w:tab w:val="num" w:pos="3600"/>
+        </w:tabs>
+        <w:ind w:left="3600" w:hanging="360"/>
+      </w:pPr>
+      <w:rPr>
+        <w:rFonts w:ascii="Wingdings" w:hAnsi="Wingdings" w:hint="default"/>
+        <w:sz w:val="20"/>
+      </w:rPr>
+    </w:lvl>
+    <w:lvl w:ilvl="5" w:tentative="1">
+      <w:start w:val="1"/>
+      <w:numFmt w:val="bullet"/>
+      <w:lvlText w:val=""/>
+      <w:lvlJc w:val="left"/>
+      <w:pPr>
+        <w:tabs>
+          <w:tab w:val="num" w:pos="4320"/>
+        </w:tabs>
+        <w:ind w:left="4320" w:hanging="360"/>
+      </w:pPr>
+      <w:rPr>
+        <w:rFonts w:ascii="Wingdings" w:hAnsi="Wingdings" w:hint="default"/>
+        <w:sz w:val="20"/>
+      </w:rPr>
+    </w:lvl>
+    <w:lvl w:ilvl="6" w:tentative="1">
+      <w:start w:val="1"/>
+      <w:numFmt w:val="bullet"/>
+      <w:lvlText w:val=""/>
+      <w:lvlJc w:val="left"/>
+      <w:pPr>
+        <w:tabs>
+          <w:tab w:val="num" w:pos="5040"/>
+        </w:tabs>
+        <w:ind w:left="5040" w:hanging="360"/>
+      </w:pPr>
+      <w:rPr>
+        <w:rFonts w:ascii="Wingdings" w:hAnsi="Wingdings" w:hint="default"/>
+        <w:sz w:val="20"/>
+      </w:rPr>
+    </w:lvl>
+    <w:lvl w:ilvl="7" w:tentative="1">
+      <w:start w:val="1"/>
+      <w:numFmt w:val="bullet"/>
+      <w:lvlText w:val=""/>
+      <w:lvlJc w:val="left"/>
+      <w:pPr>
+        <w:tabs>
+          <w:tab w:val="num" w:pos="5760"/>
+        </w:tabs>
+        <w:ind w:left="5760" w:hanging="360"/>
+      </w:pPr>
+      <w:rPr>
+        <w:rFonts w:ascii="Wingdings" w:hAnsi="Wingdings" w:hint="default"/>
+        <w:sz w:val="20"/>
+      </w:rPr>
+    </w:lvl>
+    <w:lvl w:ilvl="8" w:tentative="1">
+      <w:start w:val="1"/>
+      <w:numFmt w:val="bullet"/>
+      <w:lvlText w:val=""/>
+      <w:lvlJc w:val="left"/>
+      <w:pPr>
+        <w:tabs>
+          <w:tab w:val="num" w:pos="6480"/>
+        </w:tabs>
+        <w:ind w:left="6480" w:hanging="360"/>
+      </w:pPr>
+      <w:rPr>
+        <w:rFonts w:ascii="Wingdings" w:hAnsi="Wingdings" w:hint="default"/>
+        <w:sz w:val="20"/>
+      </w:rPr>
+    </w:lvl>
+  </w:abstractNum>
   <w:num w:numId="1" w16cid:durableId="1964384161">
     <w:abstractNumId w:val="1"/>
   </w:num>
   <w:num w:numId="2" w16cid:durableId="893614773">
     <w:abstractNumId w:val="0"/>
+  </w:num>
+  <w:num w:numId="3" w16cid:durableId="167916138">
+    <w:abstractNumId w:val="2"/>
+  </w:num>
+  <w:num w:numId="4" w16cid:durableId="2123261825">
+    <w:abstractNumId w:val="3"/>
   </w:num>
 </w:numbering>
 </file>
@@ -1543,7 +5282,6 @@
   <w:style w:type="character" w:default="1" w:styleId="DefaultParagraphFont">
     <w:name w:val="Default Paragraph Font"/>
     <w:uiPriority w:val="1"/>
-    <w:semiHidden/>
     <w:unhideWhenUsed/>
   </w:style>
   <w:style w:type="table" w:default="1" w:styleId="TableNormal">
@@ -1856,6 +5594,60 @@
       <w:color w:val="0F4761" w:themeColor="accent1" w:themeShade="BF"/>
       <w:spacing w:val="5"/>
     </w:rPr>
+  </w:style>
+  <w:style w:type="character" w:styleId="Hyperlink">
+    <w:name w:val="Hyperlink"/>
+    <w:basedOn w:val="DefaultParagraphFont"/>
+    <w:uiPriority w:val="99"/>
+    <w:unhideWhenUsed/>
+    <w:rsid w:val="003F6A81"/>
+    <w:rPr>
+      <w:color w:val="467886" w:themeColor="hyperlink"/>
+      <w:u w:val="single"/>
+    </w:rPr>
+  </w:style>
+  <w:style w:type="character" w:styleId="UnresolvedMention">
+    <w:name w:val="Unresolved Mention"/>
+    <w:basedOn w:val="DefaultParagraphFont"/>
+    <w:uiPriority w:val="99"/>
+    <w:semiHidden/>
+    <w:unhideWhenUsed/>
+    <w:rsid w:val="003F6A81"/>
+    <w:rPr>
+      <w:color w:val="605E5C"/>
+      <w:shd w:val="clear" w:color="auto" w:fill="E1DFDD"/>
+    </w:rPr>
+  </w:style>
+  <w:style w:type="character" w:styleId="FollowedHyperlink">
+    <w:name w:val="FollowedHyperlink"/>
+    <w:basedOn w:val="DefaultParagraphFont"/>
+    <w:uiPriority w:val="99"/>
+    <w:semiHidden/>
+    <w:unhideWhenUsed/>
+    <w:rsid w:val="003F6A81"/>
+    <w:rPr>
+      <w:color w:val="96607D" w:themeColor="followedHyperlink"/>
+      <w:u w:val="single"/>
+    </w:rPr>
+  </w:style>
+  <w:style w:type="table" w:styleId="TableGrid">
+    <w:name w:val="Table Grid"/>
+    <w:basedOn w:val="TableNormal"/>
+    <w:uiPriority w:val="39"/>
+    <w:rsid w:val="00693FBB"/>
+    <w:pPr>
+      <w:spacing w:after="0" w:line="240" w:lineRule="auto"/>
+    </w:pPr>
+    <w:tblPr>
+      <w:tblBorders>
+        <w:top w:val="single" w:sz="4" w:space="0" w:color="auto"/>
+        <w:left w:val="single" w:sz="4" w:space="0" w:color="auto"/>
+        <w:bottom w:val="single" w:sz="4" w:space="0" w:color="auto"/>
+        <w:right w:val="single" w:sz="4" w:space="0" w:color="auto"/>
+        <w:insideH w:val="single" w:sz="4" w:space="0" w:color="auto"/>
+        <w:insideV w:val="single" w:sz="4" w:space="0" w:color="auto"/>
+      </w:tblBorders>
+    </w:tblPr>
   </w:style>
 </w:styles>
 </file>

</xml_diff>